<commit_message>
new main figure added to the manuscript
</commit_message>
<xml_diff>
--- a/index.docx
+++ b/index.docx
@@ -43,7 +43,7 @@
         <w:pStyle w:val="BodyText"/>
       </w:pPr>
       <w:r>
-        <w:t xml:space="preserve">Heart rate variability (HRV) is the basis of non-invasive autonomic nervous system assessment, yet its analysis is constrained by the non-stationary nature of physiological signals. Standard analytical methods, which assume stationarity within fixed time windows, fail to capture dynamical effects of interest, such as the response to a physiological stressor. This limitation obstructs the development of mechanistic hypotheses about autonomic control. Here, we address this challenge by introducing a unified probabilistic framework for non-stationary HRV analysis. We propose a hypothesis-driven, generative model that transforms the physiological response as a continuous-time stochastic process controlled by a double-logistic function. This approach deconstructs the R-R interval (RRi) series into a set of interpretable parameters representing the latency, rate, and magnitude of distinct response and recovery phases. Through simulation, we establish the model’s ability to achieve high-fidelity parameter recovery and show its descriptive superiority over conventional fixed-time window methods. We then apply the framework to an empirical exercise-recovery recording, generating a precise, falsifiable hypothesis of</w:t>
+        <w:t xml:space="preserve">Heart rate variability (HRV) forms the basis of non-invasive autonomic nervous system assessment; however, its analysis is constrained by the non-stationary nature of physiological signals. Standard analytical methods, which assume stationarity within fixed time windows, fail to capture dynamical effects of interest, such as the response to a physiological stressor. This limitation obstructs the development of mechanistic hypotheses about autonomic control. Here, we address this challenge by introducing a unified probabilistic framework for non-stationary HRV analysis. We propose a hypothesis-driven, generative model that transforms the physiological response into a continuous-time stochastic process controlled by a double-logistic function. This approach deconstructs the R-R interval (RRi) series into a set of interpretable parameters representing the latency, rate, and magnitude of distinct response and recovery phases. Through simulation, we establish the model’s ability to achieve high-fidelity parameter recovery and show its descriptive superiority over conventional fixed-time window methods. We then apply the framework to an empirical exercise-recovery recording, generating a precise, falsifiable hypothesis of</w:t>
       </w:r>
       <w:r>
         <w:t xml:space="preserve"> </w:t>
@@ -69,7 +69,7 @@
         <w:pStyle w:val="FirstParagraph"/>
       </w:pPr>
       <w:r>
-        <w:t xml:space="preserve">The central goal in contemporary biomedical science is to mechanistically link the dynamics of physiological systems to human health and disease. A primary obstacle to this goal is the inferential gap between what can be measure with high-temporal resolution via wearable sensors, and the unobservable neurobiological processes that generate these measurements</w:t>
+        <w:t xml:space="preserve">The central goal in contemporary biomedical science is to mechanistically link the dynamics of physiological systems to human health and disease. A primary obstacle to this goal is the inferential gap between what can be measured with high-temporal resolution via wearable sensors and the unobservable neurobiological processes that generate these measurements</w:t>
       </w:r>
       <w:r>
         <w:t xml:space="preserve"> </w:t>
@@ -99,7 +99,7 @@
         <w:t xml:space="preserve">(Shaffer and Ginsberg 2017; Castillo-Aguilar, Mabe-Castro, et al. 2023; Castillo-Aguilar, Mabe Castro, et al. 2023)</w:t>
       </w:r>
       <w:r>
-        <w:t xml:space="preserve">. The R-R interval (RRi) time-series is an invaluable signal, yet it poses a deep analytical challenge: it is a complex, integrated output reflecting the ceaseless, dynamic interplay of multiple regulatory systems</w:t>
+        <w:t xml:space="preserve">. The R-R interval (RRi) time-series is an invaluable signal, yet it poses a profound analytical challenge: it is a complex, integrated output reflecting the ceaseless, dynamic interplay of multiple regulatory systems</w:t>
       </w:r>
       <w:r>
         <w:t xml:space="preserve"> </w:t>
@@ -143,7 +143,7 @@
         <w:pStyle w:val="BodyText"/>
       </w:pPr>
       <w:r>
-        <w:t xml:space="preserve">The analytical tools currently employed by the majority of researchers are unsuited for this task. The prevailing paradigm, which relies on calculating summary statistics within fixed temporal windows, imposes a static, linear worldview on a system that is intrinsically dynamic and non-linear. The use of fixed temporal windows is made on the assumption of stationarity that is inherently violated during any physiological transition of scientific or clinical interest</w:t>
+        <w:t xml:space="preserve">The analytical tools currently employed by most researchers are unsuited for this task. The prevailing paradigm, which relies on calculating summary statistics within fixed temporal windows, imposes a static, linear worldview on a system that is intrinsically dynamic and non-linear. The use of fixed temporal windows is based on the assumption of stationarity, which is inherently violated during any physiological transition of scientific or clinical interest</w:t>
       </w:r>
       <w:r>
         <w:t xml:space="preserve"> </w:t>
@@ -152,7 +152,7 @@
         <w:t xml:space="preserve">(Shaffer, Meehan, and Zerr 2020; Kim, Seok, and Shin 2021)</w:t>
       </w:r>
       <w:r>
-        <w:t xml:space="preserve">. A core limitation for mechanistic inference is relying on static assumptions, producing misleading and often uninterpretable results</w:t>
+        <w:t xml:space="preserve">. A core limitation for mechanistic inference is its reliance on static assumptions, which can produce misleading and often uninterpretable results</w:t>
       </w:r>
       <w:r>
         <w:t xml:space="preserve"> </w:t>
@@ -170,7 +170,7 @@
         <w:t xml:space="preserve">(Shaffer, Meehan, and Zerr 2020; Kim, Seok, and Shin 2021)</w:t>
       </w:r>
       <w:r>
-        <w:t xml:space="preserve">. The unavoidable distortion of RRi signals under non-stationary conditions, where their inherent assumptions are not met, can make it impossible to distinguish between a resilient individual who exhibits a rapid and robust recovery from a vulnerable one, with a dampened recovery, a critical biomarker of pathology</w:t>
+        <w:t xml:space="preserve">. The unavoidable distortion of RRi signals under non-stationary conditions, where their inherent assumptions are not met, can make it impossible to distinguish between a resilient individual who exhibits a rapid and robust recovery from a vulnerable one with a dampened recovery, a critical biomarker of pathology</w:t>
       </w:r>
       <w:r>
         <w:t xml:space="preserve"> </w:t>
@@ -243,7 +243,7 @@
         <w:t xml:space="preserve">(Martı́n-González et al. 2018; Rosas et al. 2024)</w:t>
       </w:r>
       <w:r>
-        <w:t xml:space="preserve">. While powerful, their typical formulations trade physiological fidelity for mathematical convenience; the latent states they infer are often defined by statistical properties rather than direct biological identity</w:t>
+        <w:t xml:space="preserve">. While powerful, their typical formulations often trade physiological fidelity for mathematical convenience; the latent states they infer are frequently defined by statistical properties rather than direct biological identity</w:t>
       </w:r>
       <w:r>
         <w:t xml:space="preserve"> </w:t>
@@ -252,7 +252,7 @@
         <w:t xml:space="preserve">(Rosas et al. 2024; Liu, Perley, and Coleman 2024)</w:t>
       </w:r>
       <w:r>
-        <w:t xml:space="preserve">. Even in more tailored applications designed to enhance interpretability, SSMs excel at tracking continuously varying processes but are not explicitly structured to parameterize the distinct phases of a discrete physiological event, such as the specific onset rate, recovery latency, and adaptive magnitude of a stress response. Consequently, the field remains methodologically stalled, caught between descriptive tools that cannot test mechanisms and abstract models whose parameters do not directly map onto the discrete, event-driven components of a physiological hypothesis.</w:t>
+        <w:t xml:space="preserve">. Even in more tailored applications designed to enhance interpretability, SSMs excel at tracking continuously varying processes; however, they are not explicitly structured to parameterize the distinct phases of a discrete physiological event, such as the specific onset rate, recovery latency, and adaptive magnitude of a stress response. Consequently, the field remains methodologically stalled, caught between descriptive tools that cannot test mechanisms and abstract models whose parameters do not directly map onto the discrete, event-driven components of a physiological hypothesis.</w:t>
       </w:r>
     </w:p>
     <w:p>
@@ -260,7 +260,7 @@
         <w:pStyle w:val="BodyText"/>
       </w:pPr>
       <w:r>
-        <w:t xml:space="preserve">Bridging the gap between data and mechanism requires an evolution in analytical philosophy, a shift from model-agnostic data description to the construction of hypothesis-driven, generative models. Such an approach should move beyond simply characterizing what the data looks like and instead focus on creating explicit, testable, and quantitative models of the biological processes that produced it. Here, we introduce and validate such a framework, which reframes physiological analysis as a form of formal hypothesis testing. We propose that a stereotyped autonomic response to an acute perturbation is a structured and dynamic process. Consequently, we propose that it can be effectively modeled as a continuous-time stochastic process, allowing us to separate the structured response from inherent biological variability. Specifically, we model the response trajectory using a double-logistic function. This mathematical form is chosen as a parsimonious hypothesis for biphasic dynamics, designed to capture the characteristic onset and subsequent recovery phases</w:t>
+        <w:t xml:space="preserve">Bridging the gap between data and mechanism requires an evolution in analytical philosophy, a shift from model-agnostic data description to the construction of hypothesis-driven, generative models. Such an approach should move beyond simply characterizing what the data looks like and instead focus on creating explicit, testable, and quantitative models of the biological processes that produced it. Here, we introduce and validate a framework that reframes physiological analysis as a form of formal hypothesis testing. We propose that a stereotyped autonomic response to an acute perturbation is a structured and dynamic process. Consequently, we suggest that it can be effectively modeled as a continuous-time stochastic process, allowing us to separate the structured response from inherent biological variability. Specifically, we model the response trajectory using a double-logistic function. This mathematical form is chosen as a parsimonious hypothesis for biphasic dynamics, designed to capture the characteristic onset and subsequent recovery phases</w:t>
       </w:r>
       <w:r>
         <w:t xml:space="preserve"> </w:t>
@@ -278,7 +278,7 @@
         <w:t xml:space="preserve">(Castillo-Aguilar et al. 2025)</w:t>
       </w:r>
       <w:r>
-        <w:t xml:space="preserve">. This provides a direct, quantitative understanding of the system’s underlying reactivity and resilience.</w:t>
+        <w:t xml:space="preserve">. This mechanism provides a direct, quantitative understanding of the system’s underlying reactivity and resilience.</w:t>
       </w:r>
     </w:p>
     <w:p>
@@ -286,7 +286,7 @@
         <w:pStyle w:val="BodyText"/>
       </w:pPr>
       <w:r>
-        <w:t xml:space="preserve">We implement this approach as a novel generative model within a Bayesian framework. This provides robust parameter estimation with full uncertainty quantification, enables hierarchical modeling of individual and group-level effects, and offers a basis for model comparison and evaluation. This model provides a specific and testable implementation of our framework, decomposing the RRi series into a time-varying mean, total variance, and a dynamically shifting oscillatory component, all controlled by a double-logistic latent dynamic. This paper tests the hypothesis that this model provides a more accurate and useful characterization of autonomic dynamics than existing fixed-time window methods. Through simulation, we demonstrate its capacity to recover known ground-truth parameters, which establishes its core validity. We contend that this approach provides the necessary quantitative indices for developing and testing mechanistic physiological hypotheses. This represents a step towards translating complex time-series into falsifiable knowledge.</w:t>
+        <w:t xml:space="preserve">We implement this approach as a novel generative model within a Bayesian framework. This model provides robust parameter estimation with full uncertainty quantification, will allow hierarchical modeling of individual and group-level effects, and offers a basis for model comparison and evaluation. This model provides a specific and testable implementation of our framework, decomposing the RRi series into a time-varying mean, total variance, and a dynamically shifting oscillatory component, all controlled by a double-logistic latent dynamic. This paper tests the hypothesis that this model provides a more accurate and functional characterization of autonomic dynamics than existing fixed-time window methods. Through simulation, we demonstrate its capacity to recover known ground-truth parameters, which establishes its core validity. We contend that this approach provides the necessary quantitative indices for developing and testing mechanistic physiological hypotheses. This model represents a step towards translating complex time series into falsifiable knowledge.</w:t>
       </w:r>
     </w:p>
     <w:bookmarkEnd w:id="20"/>
@@ -307,32 +307,12 @@
         <w:t xml:space="preserve">We first test the model’s internal consistency by assessing its ability to recover its own parameters from simulated data. We then benchmark its descriptive fidelity against conventional methods to quantify its effectiveness in characterizing dynamic signals. Finally, we use the framework to generate a structured, phenomenological description of an empirical exercise-response signal, illustrating its potential for developing precise and data-driven hypotheses.</w:t>
       </w:r>
     </w:p>
-    <w:bookmarkStart w:id="22" w:name="X9c2ecb1ed3ac6a0cac2e8bfe22e596d5ab34a26"/>
-    <w:p>
-      <w:pPr>
-        <w:pStyle w:val="Heading2"/>
-      </w:pPr>
-      <w:r>
-        <w:t xml:space="preserve">Model validation and parameter recovery on synthetic data</w:t>
-      </w:r>
-    </w:p>
-    <w:p>
-      <w:pPr>
-        <w:pStyle w:val="FirstParagraph"/>
-      </w:pPr>
-      <w:r>
-        <w:t xml:space="preserve">To establish the model’s internal consistency and the identifiability of its parameters, we first assessed its ability to perform inference on synthetic data generated from its own structure. This in-silico procedure serves as a necessary check of the model’s self-consistency and the estimation algorithm’s ability to navigate the complex posterior geometry. To test the model’s performance, designed three distinct scenarios: (A) a canonical response with complete recovery; (B) an incomplete recovery with persistence in both time and frequency domains; and (C) a high-noise condition with a low structured variance fraction (</w:t>
-      </w:r>
-      <m:oMath>
-        <m:r>
-          <m:t>w</m:t>
-        </m:r>
-      </m:oMath>
-      <w:r>
-        <w:t xml:space="preserve"> </w:t>
-      </w:r>
-      <w:r>
-        <w:t xml:space="preserve">= 0.6). The ground-truth dynamics are illustrated in Figure 1, with corresponding generative parameter values listed in Table 1. This procedure tests for inferential integrity under the assumption that the model is correctly specified; it does not test for robustness to model misspecification, a challenge inherent to all empirical data.</w:t>
+    <w:p>
+      <w:pPr>
+        <w:pStyle w:val="BodyText"/>
+      </w:pPr>
+      <w:r>
+        <w:t xml:space="preserve">The core components of the model, related the underlying data generation process being modeled, are illustrated in Figure 1.</w:t>
       </w:r>
     </w:p>
     <w:p>
@@ -344,7 +324,50 @@
           <w:b/>
           <w:bCs/>
         </w:rPr>
-        <w:t xml:space="preserve">Figure 1. Ground-truth dynamics of three synthetic scenarios.</w:t>
+        <w:t xml:space="preserve">Figure 1. Core components underlying observed RRi signals captured by the model</w:t>
+      </w:r>
+      <w:r>
+        <w:t xml:space="preserve">. The data generation process being modeled is illustrated for a linear combination of time and frequency components that build the underlying observed RRi signal. In the top of the figure lies the model with each component separated in the subsequent bottom panels.</w:t>
+      </w:r>
+    </w:p>
+    <w:bookmarkStart w:id="22" w:name="X9c2ecb1ed3ac6a0cac2e8bfe22e596d5ab34a26"/>
+    <w:p>
+      <w:pPr>
+        <w:pStyle w:val="Heading2"/>
+      </w:pPr>
+      <w:r>
+        <w:t xml:space="preserve">Model validation and parameter recovery on synthetic data</w:t>
+      </w:r>
+    </w:p>
+    <w:p>
+      <w:pPr>
+        <w:pStyle w:val="FirstParagraph"/>
+      </w:pPr>
+      <w:r>
+        <w:t xml:space="preserve">To establish the model’s internal consistency and the identifiability of its parameters, we first assessed its ability to perform inference on synthetic data generated from its own structure. This in-silico procedure serves as a necessary check of the model’s self-consistency and the estimation algorithm’s ability to navigate the complex posterior geometry. To test the model’s performance, three distinct scenarios were designed: (A) a canonical response with complete recovery; (B) an incomplete recovery with persistence in both time and frequency domains; and (C) a high-noise condition with a low structured variance fraction (</w:t>
+      </w:r>
+      <m:oMath>
+        <m:r>
+          <m:t>w</m:t>
+        </m:r>
+      </m:oMath>
+      <w:r>
+        <w:t xml:space="preserve"> </w:t>
+      </w:r>
+      <w:r>
+        <w:t xml:space="preserve">= 0.6). The ground-truth dynamics are illustrated in Figure 2, with corresponding generative parameter values listed in Table 1. This procedure tests for inferential integrity under the assumption that the model is correctly specified; it does not test for robustness to model misspecification, a challenge inherent to all empirical data.</w:t>
+      </w:r>
+    </w:p>
+    <w:p>
+      <w:pPr>
+        <w:pStyle w:val="BodyText"/>
+      </w:pPr>
+      <w:r>
+        <w:rPr>
+          <w:b/>
+          <w:bCs/>
+        </w:rPr>
+        <w:t xml:space="preserve">Figure 2. Ground-truth dynamics of three synthetic scenarios.</w:t>
       </w:r>
       <w:r>
         <w:t xml:space="preserve"> </w:t>
@@ -376,7 +399,7 @@
         <w:pStyle w:val="BodyText"/>
       </w:pPr>
       <w:r>
-        <w:t xml:space="preserve">When fit to this synthetic data, the model demonstrated a high-fidelity reconstruction of the generative process across all three scenarios. Figure 2 presents a visual summary of these results, plotting the model’s posterior estimates against the known ground-truth trajectories. The posterior means for the baseline RRi, total SDNN, and the time-varying spectral proportions closely track the true underlying dynamics. The 95% credible intervals, which represent the range of plausible parameter values given the data, consistently envelop the ground-truth trajectories.</w:t>
+        <w:t xml:space="preserve">When fit to this synthetic data, the model demonstrated a high-fidelity reconstruction of the generative process across all three scenarios. Figure 3 presents a visual summary of these results, plotting the model’s posterior estimates against the known ground-truth trajectories. The posterior means for the baseline RRi, total SDNN, and the time-varying spectral proportions closely track the true underlying dynamics. The 95% credible intervals, which represent the range of plausible parameter values given the data, consistently envelop the ground-truth trajectories.</w:t>
       </w:r>
     </w:p>
     <w:p>
@@ -388,7 +411,7 @@
           <w:b/>
           <w:bCs/>
         </w:rPr>
-        <w:t xml:space="preserve">Figure 2. High-fidelity reconstruction of synthetic data by the generative model.</w:t>
+        <w:t xml:space="preserve">Figure 3. High-fidelity reconstruction of synthetic data by the generative model.</w:t>
       </w:r>
       <w:r>
         <w:t xml:space="preserve"> </w:t>
@@ -445,7 +468,7 @@
         <w:pStyle w:val="BodyText"/>
       </w:pPr>
       <w:r>
-        <w:t xml:space="preserve">The results of this comparative analysis highlights the descriptive distortions that are inherent to any method that relies on assumptions of local stationarity when applied to a continuously varying, non-stationary signal. Figure 3 illustrates the outputs from the windowed methods. Visually, these methods produced a delayed and morphologically blunted approximation of the underlying dynamics. The sharp, non-linear transitions that characterize the onset and recovery phases of the signal are smeared and flattened by the averaging process inherent in the windowed calculation. Consequently, the windowed approach failed to accurately capture both the shape and the precise timing of the recovery process. Instead of reflecting the smooth, logistic curve defined by the ground-truth process, the windowed analysis superimposed the square-wave artifacts of its own computational structure onto the data, a clear instance of the analytical method distorting the phenomenon it is intended to measure.</w:t>
+        <w:t xml:space="preserve">The results of this comparative analysis highlights the descriptive distortions that are inherent to any method that relies on assumptions of local stationarity when applied to a continuously varying, non-stationary signal. Figure 4 illustrates the outputs from the windowed methods. Visually, these methods produced a delayed and morphologically blunted approximation of the underlying dynamics. The sharp, non-linear transitions that characterize the onset and recovery phases of the signal are smeared and flattened by the averaging process inherent in the windowed calculation. Consequently, the windowed approach failed to accurately capture both the shape and the precise timing of the recovery process. Instead of reflecting the smooth, logistic curve defined by the ground-truth process, the windowed analysis superimposed the square-wave artifacts of its own computational structure onto the data, a clear instance of the analytical method distorting the phenomenon it is intended to measure.</w:t>
       </w:r>
     </w:p>
     <w:p>
@@ -457,7 +480,7 @@
           <w:b/>
           <w:bCs/>
         </w:rPr>
-        <w:t xml:space="preserve">Figure 3. Distorted reconstruction of synthetic data by conventional windowed Methods.</w:t>
+        <w:t xml:space="preserve">Figure 4. Distorted reconstruction of synthetic data by conventional windowed Methods.</w:t>
       </w:r>
       <w:r>
         <w:t xml:space="preserve"> </w:t>
@@ -537,7 +560,7 @@
         <w:pStyle w:val="BodyText"/>
       </w:pPr>
       <w:r>
-        <w:t xml:space="preserve">Further model diagnostics testing the model overall stability and reliability can be seen in the supplementary material. Prior predictive checks can be seen in Figure S1; prior sensitivity analysis in Figure S2; full posterior distributions in Figure S3; model fit to asymmetric recovery data from a different data generation processess can be seen in Figure S4 and non-gaussian distributions in Figure S5.</w:t>
+        <w:t xml:space="preserve">Further model diagnostics testing the model’s overall stability and reliability can be found in the supplementary material. Prior predictive checks are shown in Figure S1, prior sensitivity analysis in Figure S2, full posterior distributions in Figure S3, and model fit to asymmetric recovery data from a different data generation process in Figure S4. Additionally, non-Gaussian distributions are presented in Figure S5.</w:t>
       </w:r>
     </w:p>
     <w:bookmarkEnd w:id="21"/>
@@ -564,7 +587,7 @@
         <w:pStyle w:val="BodyText"/>
       </w:pPr>
       <w:r>
-        <w:t xml:space="preserve">Upon fitting the model to the empirical data, it yields a phenomenological decomposition of the entire exercise-recovery response, as depicted in Figure 4. The framework parses the signal into its constituent components, describing the physiological process as a rapid initial tachycardia (a decrease in the baseline RRi component) and a concurrent suppression of total heart rate variability (a decrease in the SDNN component). This initial response is followed by a slower, more gradual recovery phase after the cessation of the exercise stimulus. From a spectral perspective, the model attributes the signature of this response to a near-complete withdrawal of power in the high-frequency (HF) band, a correlate of parasympathetic activity, and a corresponding surge in the proportion of very-low-frequency (VLF) power, a band whose physiological interpretation remains debated but is often associated with sympathetic and other systemic influences. The model captures these dynamics as continuous, smooth trajectories, providing an integrated narrative of the entire physiological event.</w:t>
+        <w:t xml:space="preserve">Upon fitting the model to the empirical data, it yields a phenomenological decomposition of the entire exercise-recovery response, as depicted in Figure 5. The framework parses the signal into its constituent components, describing the physiological process as a rapid initial tachycardia (a decrease in the baseline RRi component) and a concurrent suppression of total heart rate variability (a decrease in the SDNN component). This initial response is followed by a slower, more gradual recovery phase after the cessation of the exercise stimulus. From a spectral perspective, the model attributes the signature of this response to a near-complete withdrawal of power in the high-frequency (HF) band, a correlate of parasympathetic activity, and a corresponding surge in the proportion of very-low-frequency (VLF) power, a band whose physiological interpretation remains debated but is often associated with sympathetic and other systemic influences. The model captures these dynamics as continuous, smooth trajectories, providing an integrated narrative of the entire physiological event.</w:t>
       </w:r>
     </w:p>
     <w:p>
@@ -576,7 +599,7 @@
           <w:b/>
           <w:bCs/>
         </w:rPr>
-        <w:t xml:space="preserve">Figure 4. Phenomenological decomposition of an empirical exercise-recovery response.</w:t>
+        <w:t xml:space="preserve">Figure 5. Phenomenological decomposition of an empirical exercise-recovery response.</w:t>
       </w:r>
       <w:r>
         <w:t xml:space="preserve"> </w:t>
@@ -694,7 +717,7 @@
         </m:r>
       </m:oMath>
       <w:r>
-        <w:t xml:space="preserve">, orange). (D) The inferred dynamics of the spectral proportions. Shaded regions are 95% highest density intervals.</w:t>
+        <w:t xml:space="preserve">, orange). (D) The inferred dynamics of the spectral proportions. The shaded regions represent the 95% highest density intervals.</w:t>
       </w:r>
     </w:p>
     <w:p>
@@ -702,7 +725,7 @@
         <w:pStyle w:val="BodyText"/>
       </w:pPr>
       <w:r>
-        <w:t xml:space="preserve">The framework’s primary scientific utility, however, lies in generating quantitative, testable claims, which are encapsulated by the posterior distributions of its parameters (Figure 5). A key feature of the model is its separate parameterization of the recovery dynamics of the signal’s first moment (mean RRi, via the coefficient</w:t>
+        <w:t xml:space="preserve">The framework’s primary scientific utility, however, lies in generating quantitative, testable claims, which are encapsulated by the posterior distributions of its parameters (Figure 6). A key feature of the model is its separate parameterization of the recovery dynamics of the signal’s first moment (mean RRi, via the coefficient</w:t>
       </w:r>
       <w:r>
         <w:t xml:space="preserve"> </w:t>
@@ -797,7 +820,7 @@
           <w:b/>
           <w:bCs/>
         </w:rPr>
-        <w:t xml:space="preserve">Figure 5. Posterior distribution of phenomenological recovery parameters from the empirical analysis.</w:t>
+        <w:t xml:space="preserve">Figure 6. Posterior distribution of phenomenological recovery parameters from the empirical analysis.</w:t>
       </w:r>
       <w:r>
         <w:t xml:space="preserve"> </w:t>
@@ -838,7 +861,7 @@
         <w:pStyle w:val="FirstParagraph"/>
       </w:pPr>
       <w:r>
-        <w:t xml:space="preserve">The quantitative analysis of HRV has long been a principal method for the non-invasive study of the autonomic nervous system</w:t>
+        <w:t xml:space="preserve">The quantitative analysis of HRV has long been a primary method for the non-invasive study of the autonomic nervous system</w:t>
       </w:r>
       <w:r>
         <w:t xml:space="preserve"> </w:t>
@@ -865,7 +888,7 @@
         <w:t xml:space="preserve">(Rajendra Acharya et al. 2006; Lu et al. 2023)</w:t>
       </w:r>
       <w:r>
-        <w:t xml:space="preserve">. The present study was undertaken to develop and evaluate a generative probabilistic model for RRi time series, explicitly designed to represent and infer the parameters of transient physiological events. Our findings, based on a comprehensive suite of simulations and an empirical application, suggest that this inferential paradigm provides a more accurate and granular characterization of autonomic dynamics than is achievable with conventional windowed approaches. Our generative model offers a more detailed characterization of autonomic dynamics, however its interpretation requires careful consideration of its underlying assumptions.</w:t>
+        <w:t xml:space="preserve">. The present study was undertaken to develop and evaluate a generative probabilistic model for RRi time series, explicitly designed to represent and infer the parameters of transient physiological events. Our findings, based on a comprehensive suite of simulations and an empirical application, suggest that this inferential paradigm offers a more accurate and granular characterization of autonomic dynamics compared to what conventional windowed approaches can achieve. Our generative model provides a more detailed characterization of autonomic dynamics; however, its interpretation requires careful consideration of its underlying assumptions.</w:t>
       </w:r>
     </w:p>
     <w:p>
@@ -873,7 +896,7 @@
         <w:pStyle w:val="BodyText"/>
       </w:pPr>
       <w:r>
-        <w:t xml:space="preserve">The primary contribution of this research is the novel synthesis and application of established Bayesian inference principles to construct a purpose-built, physiologically-oriented measurement instrument</w:t>
+        <w:t xml:space="preserve">The primary contribution of this research is the novel synthesis and application of established Bayesian inference principles to construct a purpose-built, physiologically oriented measurement instrument</w:t>
       </w:r>
       <w:r>
         <w:t xml:space="preserve"> </w:t>
@@ -968,7 +991,7 @@
         <w:t xml:space="preserve">(Hines, Middendorf, and Aldrich 2014; Hyvärinen, Khemakhem, and Monti 2024)</w:t>
       </w:r>
       <w:r>
-        <w:t xml:space="preserve">, nonetheless it is a convenient simplification of cardiovascular physiology.</w:t>
+        <w:t xml:space="preserve">; nonetheless, it is a convenient simplification of cardiovascular physiology.</w:t>
       </w:r>
     </w:p>
     <w:p>
@@ -976,7 +999,7 @@
         <w:pStyle w:val="BodyText"/>
       </w:pPr>
       <w:r>
-        <w:t xml:space="preserve">Similarly, in physiology, the systems underlying these model components are deeply and non-linearly coupled. Baroreflex activity (a major contributor to the low-frequency component) and respiratory sinus arrhythmia (the high-frequency component) are not independent processes that simply sum together; they are neurologically intertwined within the brainstem and are engaged in a constant, dynamic feedback loop</w:t>
+        <w:t xml:space="preserve">Similarly, in physiology, the systems underlying these model components are deeply and non-linearly coupled. Baroreflex activity (a major contributor to the low-frequency component) and respiratory sinus arrhythmia (the high-frequency component) are not independent processes that sum together; they are neurologically intertwined within the brainstem and are engaged in a constant, dynamic feedback loop</w:t>
       </w:r>
       <w:r>
         <w:t xml:space="preserve"> </w:t>
@@ -1118,7 +1141,7 @@
         <w:t xml:space="preserve"> </w:t>
       </w:r>
       <w:r>
-        <w:t xml:space="preserve">remains a speculative hypothesis requiring external validation. Could this pattern alternatively reflect differential downregulation rates of adrenergic and cholinergic receptors, or a mismatch in the resetting of central autonomic command versus peripheral feedback? These are precisely the kinds of sophisticated hypotheses the model allows one to formulate, but it possesses no inherent capacity to adjudicate between them. It provides the tool to quantify the phenomenon with precision, thereby allowing to test such hypotheses</w:t>
+        <w:t xml:space="preserve">remains a speculative hypothesis requiring external validation. Could this pattern alternatively reflect differential downregulation rates of adrenergic and cholinergic receptors, or a mismatch in the resetting of central autonomic command versus peripheral feedback? These are precisely the kinds of sophisticated hypotheses the model allows one to formulate, but it possesses no inherent capacity to adjudicate between them. It provides the tool to quantify the phenomenon with precision, thereby allowing for the examination of such hypotheses</w:t>
       </w:r>
       <w:r>
         <w:t xml:space="preserve"> </w:t>
@@ -1239,7 +1262,7 @@
         <w:t xml:space="preserve">(Castillo-Aguilar et al. 2025)</w:t>
       </w:r>
       <w:r>
-        <w:t xml:space="preserve">, not physiological imperative; asymmetric biological recovery processes are common and would be poorly approximated by this functional form. Moreover, the model is a specialist instrument designed for a single, isolated perturbation-recovery event</w:t>
+        <w:t xml:space="preserve">, not a physiological imperative; asymmetric biological recovery processes are common and would be poorly approximated by this functional form. Moreover, the model is a specialist instrument designed for a single, isolated perturbation-recovery event</w:t>
       </w:r>
       <w:r>
         <w:t xml:space="preserve"> </w:t>
@@ -1248,7 +1271,7 @@
         <w:t xml:space="preserve">(Castillo-Aguilar et al. 2025)</w:t>
       </w:r>
       <w:r>
-        <w:t xml:space="preserve">. This make it highly effective for analyzing clean, stimulus-response experimental paradigms but makes it unsuited for the exploratory analysis of complex, naturalistic data containing multiple, overlapping events of unknown form</w:t>
+        <w:t xml:space="preserve">. This makes it highly effective for analyzing clean, stimulus-response experimental paradigms but makes it unsuited for the exploratory analysis of complex, naturalistic data containing multiple, overlapping events of unknown form</w:t>
       </w:r>
       <w:r>
         <w:t xml:space="preserve"> </w:t>
@@ -1257,7 +1280,7 @@
         <w:t xml:space="preserve">(Voss et al. 2009; Kim, Seok, and Shin 2021)</w:t>
       </w:r>
       <w:r>
-        <w:t xml:space="preserve">. It is a tool for confirmatory, not exploratory, science.</w:t>
+        <w:t xml:space="preserve">. It is a tool for confirmatory, not exploratory science.</w:t>
       </w:r>
     </w:p>
     <w:p>
@@ -1329,7 +1352,7 @@
         <w:t xml:space="preserve">“analytical divide”</w:t>
       </w:r>
       <w:r>
-        <w:t xml:space="preserve">, where such advanced methods are only accessible to research groups with substantial computational resources. This effectively sidelines the method from deployment in real-time or near-real-time clinical settings, such as intensive care monitoring, where rapid feedback is paramount. Furthermore, the model’s performance is linked to upstream data fidelity. Uncorrected premature ventricular contractions or excessive measurement noise, for instance, could drastically alter the local mean and variance of model parameters. While the model may be robust to small deviations, its behavior in the face of such gross, non-stationary artifacts is unknown and could lead to biased inference on the entire stress-recovery curve. Finally, the treatment of the residual term as unstructured</w:t>
+        <w:t xml:space="preserve">, where such advanced methods are only accessible to research groups with substantial computational resources. This effectively sidelines the method from deployment in real-time or near-real-time clinical settings, such as intensive care monitoring, where rapid feedback is paramount. Furthermore, the model’s performance is closely tied to the fidelity of upstream data. Uncorrected premature ventricular contractions or excessive measurement noise, for instance, could drastically alter the local mean and variance of model parameters. While the model may be robust to small deviations, its behavior in the face of such gross, non-stationary artifacts is unknown and could lead to biased inference on the entire stress-recovery curve. Finally, the treatment of the residual term as unstructured</w:t>
       </w:r>
       <w:r>
         <w:t xml:space="preserve"> </w:t>
@@ -1367,7 +1390,7 @@
         <w:pStyle w:val="BodyText"/>
       </w:pPr>
       <w:r>
-        <w:t xml:space="preserve">The most urgent task is to begin the process of instrument calibration. Just as a new telescope must have its optical aberrations mapped and its resolution quantified, this model requires a comprehensive characterization of its operational properties. An ideal future study would involve establishing a formal calibration protocol: creating a standardized open-source library of synthetic RRi signals with known complexities, asymmetric responses, overlapping events, various artifact types, and non-Gaussian noise, and then systematically testing the model against this library. The results, published as a detailed</w:t>
+        <w:t xml:space="preserve">The most urgent task is to initiate the calibration process for this instrument. Just as a new telescope must have its optical aberrations mapped and its resolution quantified, this model requires a comprehensive characterization of its operational properties. An ideal future study would involve establishing a formal calibration protocol: creating a standardized open-source library of synthetic RRi signals with known complexities, asymmetric responses, overlapping events, various artifact types, and non-Gaussian noise, and then systematically testing the model against this library. The results, published as a detailed</w:t>
       </w:r>
       <w:r>
         <w:t xml:space="preserve"> </w:t>
@@ -1384,7 +1407,7 @@
         <w:pStyle w:val="BodyText"/>
       </w:pPr>
       <w:r>
-        <w:t xml:space="preserve">Furthermore, future work must focus on using the model for quantitative hypothesis falsification. The framework should be applied in experimental contexts where specific interventions are known to target certain physiological pathways. For instance, testing the effect of beta-blockade on the response amplitude and recovery rate parameters following a cold pressor or exercise-based test would provide crucial external validation, linking the model’s abstract parameters to tangible pharmacological effects. This shifts the focus from</w:t>
+        <w:t xml:space="preserve">Furthermore, future work should focus on utilizing the model for quantitative hypothesis testing and falsification. The framework should be applied in experimental contexts where specific interventions are known to target certain physiological pathways. For instance, testing the effect of beta-blockade on the response amplitude and recovery rate parameters following a cold pressor or exercise-based test would provide crucial external validation, linking the model’s abstract parameters to tangible pharmacological effects. This shifts the focus from</w:t>
       </w:r>
       <w:r>
         <w:t xml:space="preserve"> </w:t>

</xml_diff>

<commit_message>
major update to the model...
- now the model allows to capture increases in time domain parameters
- After all test, seems to works fine
</commit_message>
<xml_diff>
--- a/index.docx
+++ b/index.docx
@@ -3430,7 +3430,7 @@
             <m:rPr>
               <m:sty m:val="p"/>
             </m:rPr>
-            <m:t>−</m:t>
+            <m:t>+</m:t>
           </m:r>
           <m:limLow>
             <m:e>
@@ -3546,7 +3546,7 @@
             <m:rPr>
               <m:sty m:val="p"/>
             </m:rPr>
-            <m:t>+</m:t>
+            <m:t>−</m:t>
           </m:r>
           <m:limLow>
             <m:e>
@@ -3741,7 +3741,7 @@
         <w:t xml:space="preserve"> </w:t>
       </w:r>
       <w:r>
-        <w:t xml:space="preserve">signifies the magnitude of the decline in RRi induced by the perturbation. The fractional recovery amplitude is denoted by</w:t>
+        <w:t xml:space="preserve">signifies the magnitude of the decline or increase in RRi induced by the perturbation. The fractional recovery amplitude is denoted by</w:t>
       </w:r>
       <w:r>
         <w:t xml:space="preserve"> </w:t>
@@ -3993,7 +3993,7 @@
             <m:rPr>
               <m:sty m:val="p"/>
             </m:rPr>
-            <m:t>−</m:t>
+            <m:t>+</m:t>
           </m:r>
           <m:limLow>
             <m:e>
@@ -4109,7 +4109,7 @@
             <m:rPr>
               <m:sty m:val="p"/>
             </m:rPr>
-            <m:t>+</m:t>
+            <m:t>−</m:t>
           </m:r>
           <m:limLow>
             <m:e>
@@ -4321,7 +4321,7 @@
         <w:t xml:space="preserve"> </w:t>
       </w:r>
       <w:r>
-        <w:t xml:space="preserve">are analogous to their counterparts in the baseline model, representing the resting total SDNN, the magnitude of its suppression, and its fractional recovery, respectively. The dynamics for both trajectories are driven by a shared pair of logistic transition functions,</w:t>
+        <w:t xml:space="preserve">are analogous to their counterparts in the baseline model, representing the resting total SDNN, the magnitude of its suppression or increase, and its fractional recovery, respectively. The dynamics for both trajectories are driven by a shared pair of logistic transition functions,</w:t>
       </w:r>
       <w:r>
         <w:t xml:space="preserve"> </w:t>

</xml_diff>

<commit_message>
updates on manuscript based on CNE's and DMO's inputs + new transformed figure 1
</commit_message>
<xml_diff>
--- a/index.docx
+++ b/index.docx
@@ -43,7 +43,7 @@
         <w:pStyle w:val="BodyText"/>
       </w:pPr>
       <w:r>
-        <w:t xml:space="preserve">Heart rate variability (HRV) forms the basis of non-invasive autonomic nervous system assessment; however, its analysis is constrained by the non-stationary nature of physiological signals. Standard analytical methods, which assume stationarity within fixed time windows, fail to capture dynamical effects of interest, such as the response to a physiological stressor. This limitation obstructs the development of mechanistic hypotheses about autonomic control. Here, we address this challenge by introducing a unified probabilistic framework for non-stationary HRV analysis. We propose a hypothesis-driven, generative model that transforms the physiological response into a continuous-time stochastic process controlled by a double-logistic function. This approach deconstructs the R-R interval (RRi) series into a set of interpretable parameters representing the latency, rate, and magnitude of distinct response and recovery phases. Through simulation, we establish the model’s ability to achieve high-fidelity parameter recovery and show its descriptive superiority over conventional fixed-time window methods. We then apply the framework to an empirical exercise-recovery recording, generating a precise, falsifiable hypothesis of</w:t>
+        <w:t xml:space="preserve">Heart rate variability (HRV) forms the basis of non-invasive autonomic nervous system assessment. However, its analysis is constrained by the non-stationary nature of physiological signals. Standard analytical methods, which assume stationarity within fixed time windows, fail to capture dynamical effects of interest, such as the response to a physiological stressor. This limitation obstructs the development of mechanistic hypotheses about autonomic control. Here, we address this challenge by introducing a unified probabilistic framework for non-stationary HRV analysis. We propose a hypothesis-driven, generative model that transforms the physiological response into a continuous-time stochastic process controlled by a double-logistic function. This approach deconstructs the R-R interval (RRi) series into a set of interpretable parameters representing the latency, rate, and magnitude of distinct response and recovery phases. Through simulation, we establish the model’s ability to achieve high-fidelity parameter recovery and show its descriptive superiority over conventional fixed-time window methods. We then apply the framework to an empirical exercise-recovery recording, generating a precise, falsifiable hypothesis of</w:t>
       </w:r>
       <w:r>
         <w:t xml:space="preserve"> </w:t>
@@ -52,7 +52,7 @@
         <w:t xml:space="preserve">“dissonant autonomic recovery”</w:t>
       </w:r>
       <w:r>
-        <w:t xml:space="preserve">, where mean heart rate and its variability exhibit distinct recovery timescales. This framework provides a formal methodology for translating RRi time series into quantitative, testable estimates of their generative processes.</w:t>
+        <w:t xml:space="preserve">, where mean heart rate and its variability exhibit distinct recovery timescales. The Biphasic Autonomic Non-stationary Decomposition (BAND) framework provides a formal methodology for translating RRi time series into quantitative, testable estimates of their generative processes.</w:t>
       </w:r>
     </w:p>
     <w:bookmarkStart w:id="20" w:name="introduction"/>
@@ -84,13 +84,17 @@
         <w:t xml:space="preserve"> </w:t>
       </w:r>
       <w:r>
-        <w:t xml:space="preserve">“inverse problem”</w:t>
-      </w:r>
-      <w:r>
-        <w:t xml:space="preserve"> </w:t>
-      </w:r>
-      <w:r>
-        <w:t xml:space="preserve">is specially more evident in the study of the autonomic nervous system (ANS), where heart rate variability (HRV) is the dominant non-invasive proxy</w:t>
+        <w:rPr>
+          <w:i/>
+          <w:iCs/>
+        </w:rPr>
+        <w:t xml:space="preserve">inverse problem</w:t>
+      </w:r>
+      <w:r>
+        <w:t xml:space="preserve"> </w:t>
+      </w:r>
+      <w:r>
+        <w:t xml:space="preserve">is particularly evident in the study of the autonomic nervous system (ANS), where heart rate variability (HRV) has become the dominant non-invasive marker</w:t>
       </w:r>
       <w:r>
         <w:t xml:space="preserve"> </w:t>
@@ -99,7 +103,7 @@
         <w:t xml:space="preserve">(Shaffer and Ginsberg 2017; Castillo-Aguilar, Mabe-Castro, et al. 2023; Castillo-Aguilar, Mabe Castro, et al. 2023)</w:t>
       </w:r>
       <w:r>
-        <w:t xml:space="preserve">. The R-R interval (RRi) time-series is an invaluable signal, yet it poses a profound analytical challenge: it is a complex, integrated output reflecting the ceaseless, dynamic interplay of multiple regulatory systems</w:t>
+        <w:t xml:space="preserve">. The R-R interval (RRi) time-series is an invaluable signal, yet it poses a critical analytical challenge, as it reflects the integrated and dynamic interplay of multiple regulatory systems</w:t>
       </w:r>
       <w:r>
         <w:t xml:space="preserve"> </w:t>
@@ -108,7 +112,7 @@
         <w:t xml:space="preserve">(Arakaki et al. 2023)</w:t>
       </w:r>
       <w:r>
-        <w:t xml:space="preserve">. Therefore, progress is contingent upon solving this problem of principled inverse inference: the development of a formal methodology to deconstruct this composite signal into quantitative, interpretable, and falsifiable estimates of its underlying generative processes. The urgency of this problem is made more evident by its direct relevance to major public health burdens, as autonomic dysregulation is a core feature of disorders ranging from cardiovascular diseases</w:t>
+        <w:t xml:space="preserve">. Addressing this challenge requires formal methodologies capable of deconstructing the composite signal into quantitative, interpretable, and testable estimates of its underlying generative processes. The urgency of this task is highlighted by the central role of autonomic dysregulation in conditions ranging from cardiovascular diseases</w:t>
       </w:r>
       <w:r>
         <w:t xml:space="preserve"> </w:t>
@@ -117,7 +121,10 @@
         <w:t xml:space="preserve">(Orini et al. 2023; Serhiyenko et al. 2024)</w:t>
       </w:r>
       <w:r>
-        <w:t xml:space="preserve">, to anxiety and post-traumatic stress</w:t>
+        <w:t xml:space="preserve"> </w:t>
+      </w:r>
+      <w:r>
+        <w:t xml:space="preserve">to anxiety and post-traumatic stress</w:t>
       </w:r>
       <w:r>
         <w:t xml:space="preserve"> </w:t>
@@ -126,13 +133,60 @@
         <w:t xml:space="preserve">(Schneider and Schwerdtfeger 2020; Cheng et al. 2022; Tomasi et al. 2024)</w:t>
       </w:r>
       <w:r>
-        <w:t xml:space="preserve">, where a precise characterization of system dynamics is essential for diagnosis and treatment</w:t>
-      </w:r>
-      <w:r>
-        <w:t xml:space="preserve"> </w:t>
-      </w:r>
-      <w:r>
-        <w:t xml:space="preserve">(Orini et al. 2023)</w:t>
+        <w:t xml:space="preserve">, where precise characterization of system dynamics is essential for diagnosis and treatment.</w:t>
+      </w:r>
+    </w:p>
+    <w:p>
+      <w:pPr>
+        <w:pStyle w:val="BodyText"/>
+      </w:pPr>
+      <w:r>
+        <w:t xml:space="preserve">The analytical tools most widely employed in this field remain poorly suited to the task, as the prevailing paradigm relies on calculating summary statistics within fixed temporal windows, thereby imposing a static and linear worldview on a system that is inherently dynamic and non-linear. These methods assume stationarity, an assumption routinely disrupted during physiological transitions of scientific or clinical interest</w:t>
+      </w:r>
+      <w:r>
+        <w:t xml:space="preserve"> </w:t>
+      </w:r>
+      <w:r>
+        <w:t xml:space="preserve">(Shaffer, Meehan, and Zerr 2020; Kim, Seok, and Shin 2021)</w:t>
+      </w:r>
+      <w:r>
+        <w:t xml:space="preserve">. As a result, they can produce misleading or uninterpretable outcomes. For example, by averaging across stress recovery, such methods conflate the initial sympathetic surge with the subsequent parasympathetic rebound, yielding a single opaque number that obscures the system’s adaptive capacity</w:t>
+      </w:r>
+      <w:r>
+        <w:t xml:space="preserve"> </w:t>
+      </w:r>
+      <w:r>
+        <w:t xml:space="preserve">(Shaffer, Meehan, and Zerr 2020; Kim, Seok, and Shin 2021)</w:t>
+      </w:r>
+      <w:r>
+        <w:t xml:space="preserve">. In this way, the unavoidable distortion of RRi signals under non-stationary conditions may mask critical differences between a resilient individual, characterized by rapid recovery, and a vulnerable one, marked by dampened recovery, thereby concealing an essential biomarker of pathology</w:t>
+      </w:r>
+      <w:r>
+        <w:t xml:space="preserve"> </w:t>
+      </w:r>
+      <w:r>
+        <w:t xml:space="preserve">(Lu et al. 2023)</w:t>
+      </w:r>
+      <w:r>
+        <w:t xml:space="preserve">. As a result, the</w:t>
+      </w:r>
+      <w:r>
+        <w:t xml:space="preserve"> </w:t>
+      </w:r>
+      <w:r>
+        <w:t xml:space="preserve">“discretize-and-summarize”</w:t>
+      </w:r>
+      <w:r>
+        <w:t xml:space="preserve"> </w:t>
+      </w:r>
+      <w:r>
+        <w:t xml:space="preserve">approach discards the temporal structure of the data and precludes direct estimation of core mechanistic properties such as response latencies, rates of change, and adaptive magnitudes, which represent the essential features that define the physiological process</w:t>
+      </w:r>
+      <w:r>
+        <w:t xml:space="preserve"> </w:t>
+      </w:r>
+      <w:r>
+        <w:t xml:space="preserve">(Tiwari et al. 2021)</w:t>
       </w:r>
       <w:r>
         <w:t xml:space="preserve">.</w:t>
@@ -143,64 +197,52 @@
         <w:pStyle w:val="BodyText"/>
       </w:pPr>
       <w:r>
-        <w:t xml:space="preserve">The analytical tools currently employed by most researchers are unsuited for this task. The prevailing paradigm, which relies on calculating summary statistics within fixed temporal windows, imposes a static, linear worldview on a system that is intrinsically dynamic and non-linear. The use of fixed temporal windows is based on the assumption of stationarity, which is inherently violated during any physiological transition of scientific or clinical interest</w:t>
-      </w:r>
-      <w:r>
-        <w:t xml:space="preserve"> </w:t>
-      </w:r>
-      <w:r>
-        <w:t xml:space="preserve">(Shaffer, Meehan, and Zerr 2020; Kim, Seok, and Shin 2021)</w:t>
-      </w:r>
-      <w:r>
-        <w:t xml:space="preserve">. A core limitation for mechanistic inference is its reliance on static assumptions, which can produce misleading and often uninterpretable results</w:t>
-      </w:r>
-      <w:r>
-        <w:t xml:space="preserve"> </w:t>
-      </w:r>
-      <w:r>
-        <w:t xml:space="preserve">(Kim, Seok, and Shin 2021)</w:t>
-      </w:r>
-      <w:r>
-        <w:t xml:space="preserve">. For instance, by averaging across a period of stress recovery, such methods conflate the initial sympathetic response with the subsequent parasympathetic rebound, yielding a single, opaque number that masks the system’s adaptive capacity</w:t>
-      </w:r>
-      <w:r>
-        <w:t xml:space="preserve"> </w:t>
-      </w:r>
-      <w:r>
-        <w:t xml:space="preserve">(Shaffer, Meehan, and Zerr 2020; Kim, Seok, and Shin 2021)</w:t>
-      </w:r>
-      <w:r>
-        <w:t xml:space="preserve">. The unavoidable distortion of RRi signals under non-stationary conditions, where their inherent assumptions are not met, can make it impossible to distinguish between a resilient individual who exhibits a rapid and robust recovery from a vulnerable one with a dampened recovery, a critical biomarker of pathology</w:t>
-      </w:r>
-      <w:r>
-        <w:t xml:space="preserve"> </w:t>
-      </w:r>
-      <w:r>
-        <w:t xml:space="preserve">(Lu et al. 2023)</w:t>
-      </w:r>
-      <w:r>
-        <w:t xml:space="preserve">. This</w:t>
-      </w:r>
-      <w:r>
-        <w:t xml:space="preserve"> </w:t>
-      </w:r>
-      <w:r>
-        <w:t xml:space="preserve">“discretize-and-summarize”</w:t>
-      </w:r>
-      <w:r>
-        <w:t xml:space="preserve"> </w:t>
-      </w:r>
-      <w:r>
-        <w:t xml:space="preserve">approach systematically discards the temporal structure of the data, thereby precluding the direct estimation of core mechanistic properties such as response latencies, rates of change, and adaptive magnitudes, which constitute the very essence of the physiological process</w:t>
-      </w:r>
-      <w:r>
-        <w:t xml:space="preserve"> </w:t>
-      </w:r>
-      <w:r>
-        <w:t xml:space="preserve">(Tiwari et al. 2021)</w:t>
-      </w:r>
-      <w:r>
-        <w:t xml:space="preserve">.</w:t>
+        <w:t xml:space="preserve">More sophisticated approaches have been proposed, but they too often fail to resolve the core inferential challenge, presenting instead a false dichotomy between phenomenological description and non-interpretable abstraction. On one hand, time–frequency decompositions such as the wavelet transform provide detailed visualizations of spectral dynamics, making them valuable for exploratory analysis</w:t>
+      </w:r>
+      <w:r>
+        <w:t xml:space="preserve"> </w:t>
+      </w:r>
+      <w:r>
+        <w:t xml:space="preserve">(German-Sallo 2014)</w:t>
+      </w:r>
+      <w:r>
+        <w:t xml:space="preserve">. Yet they remain fundamentally descriptive, unable to instantiate a generative model of the underlying biology. These methods can demonstrate that a change has occurred, yet they are unable to provide a parameterized and testable explanation of the underlying nature of that change</w:t>
+      </w:r>
+      <w:r>
+        <w:t xml:space="preserve"> </w:t>
+      </w:r>
+      <w:r>
+        <w:t xml:space="preserve">(Guo et al. 2022)</w:t>
+      </w:r>
+      <w:r>
+        <w:t xml:space="preserve">. On the other hand, modeling traditions like state-space models (SSMs) offer mathematical sophistication for tracking and forecasting system evolution</w:t>
+      </w:r>
+      <w:r>
+        <w:t xml:space="preserve"> </w:t>
+      </w:r>
+      <w:r>
+        <w:t xml:space="preserve">(Martı́n-González et al. 2018; Rosas et al. 2024)</w:t>
+      </w:r>
+      <w:r>
+        <w:t xml:space="preserve">. While powerful, these models frequently sacrifice physiological fidelity for mathematical convenience, as their latent states are often defined by statistical rather than biological properties</w:t>
+      </w:r>
+      <w:r>
+        <w:t xml:space="preserve"> </w:t>
+      </w:r>
+      <w:r>
+        <w:t xml:space="preserve">(Rosas et al. 2024; Liu, Perley, and Coleman 2024)</w:t>
+      </w:r>
+      <w:r>
+        <w:t xml:space="preserve">. Even in tailored applications, SSMs excel at tracking continuous variation but are not explicitly structured to parameterize the discrete phases of physiological events, such as onset rate, recovery latency, or adaptive magnitude in response to stress</w:t>
+      </w:r>
+      <w:r>
+        <w:t xml:space="preserve"> </w:t>
+      </w:r>
+      <w:r>
+        <w:t xml:space="preserve">(Rosas et al. 2024; Liu, Perley, and Coleman 2024)</w:t>
+      </w:r>
+      <w:r>
+        <w:t xml:space="preserve">. The field thus remains methodologically constrained, caught between descriptive tools that cannot test mechanisms and abstract models whose parameters do not map onto physiological hypotheses.</w:t>
       </w:r>
     </w:p>
     <w:p>
@@ -208,25 +250,16 @@
         <w:pStyle w:val="BodyText"/>
       </w:pPr>
       <w:r>
-        <w:t xml:space="preserve">Nonetheless, more sophisticated signal processing and modeling techniques have been proposed, yet these too often fail to resolve the core inferential challenge. They present a false choice between phenomenological description and non-interpretable abstraction. On one hand, time-frequency decompositions, such as the wavelet transform, excel at providing detailed visualizations of spectral dynamics, making them useful for exploratory analysis</w:t>
-      </w:r>
-      <w:r>
-        <w:t xml:space="preserve"> </w:t>
-      </w:r>
-      <w:r>
-        <w:t xml:space="preserve">(German-Sallo 2014)</w:t>
-      </w:r>
-      <w:r>
-        <w:t xml:space="preserve">. However, they are fundamentally descriptive; they do not instantiate a formal, generative model of the underlying biology. They can show that a change occurred, but they cannot provide a parameterized, testable estimate of what changed</w:t>
-      </w:r>
-      <w:r>
-        <w:t xml:space="preserve"> </w:t>
-      </w:r>
-      <w:r>
-        <w:t xml:space="preserve">(Guo et al. 2022)</w:t>
-      </w:r>
-      <w:r>
-        <w:t xml:space="preserve">.</w:t>
+        <w:t xml:space="preserve">Bridging this gap requires a conceptual shift from model-agnostic data description to the construction of hypothesis-driven frameworks grounded in generative modeling. Instead of simply characterizing what the data looks like, the focus should be on constructing explicit, testable, and quantitative models of the biological processes that generate the data. Here, we introduce and validate the Biphasic Autonomic Non-stationary Decomposition (BAND) framework, which reframes physiological analysis as a form of formal hypothesis testing. We hypothesize that autonomic responses to acute perturbations constitute structured, dynamic processes that can be effectively modeled as continuous-time stochastic dynamics. Specifically, we employ a double-logistic function as a parsimonious hypothesis for biphasic dynamics, capturing the characteristic onset and recovery phases</w:t>
+      </w:r>
+      <w:r>
+        <w:t xml:space="preserve"> </w:t>
+      </w:r>
+      <w:r>
+        <w:t xml:space="preserve">(Castillo-Aguilar et al. 2025)</w:t>
+      </w:r>
+      <w:r>
+        <w:t xml:space="preserve">. This representation translates raw signals into a small set of interpretable mechanistic parameters, including the latency, rate, and magnitude of each phase, thereby providing direct insight into autonomic reactivity and resilience.</w:t>
       </w:r>
     </w:p>
     <w:p>
@@ -234,59 +267,7 @@
         <w:pStyle w:val="BodyText"/>
       </w:pPr>
       <w:r>
-        <w:t xml:space="preserve">On the other hand, more advanced modeling traditions like state-space models (SSMs) offer mathematical intricacy for tracking and forecasting a system’s evolution</w:t>
-      </w:r>
-      <w:r>
-        <w:t xml:space="preserve"> </w:t>
-      </w:r>
-      <w:r>
-        <w:t xml:space="preserve">(Martı́n-González et al. 2018; Rosas et al. 2024)</w:t>
-      </w:r>
-      <w:r>
-        <w:t xml:space="preserve">. While powerful, their typical formulations often trade physiological fidelity for mathematical convenience; the latent states they infer are frequently defined by statistical properties rather than direct biological identity</w:t>
-      </w:r>
-      <w:r>
-        <w:t xml:space="preserve"> </w:t>
-      </w:r>
-      <w:r>
-        <w:t xml:space="preserve">(Rosas et al. 2024; Liu, Perley, and Coleman 2024)</w:t>
-      </w:r>
-      <w:r>
-        <w:t xml:space="preserve">. Even in more tailored applications designed to enhance interpretability, SSMs excel at tracking continuously varying processes; however, they are not explicitly structured to parameterize the distinct phases of a discrete physiological event, such as the specific onset rate, recovery latency, and adaptive magnitude of a stress response. Consequently, the field remains methodologically stalled, caught between descriptive tools that cannot test mechanisms and abstract models whose parameters do not directly map onto the discrete, event-driven components of a physiological hypothesis.</w:t>
-      </w:r>
-    </w:p>
-    <w:p>
-      <w:pPr>
-        <w:pStyle w:val="BodyText"/>
-      </w:pPr>
-      <w:r>
-        <w:t xml:space="preserve">Bridging the gap between data and mechanism requires an evolution in analytical philosophy, a shift from model-agnostic data description to the construction of hypothesis-driven, generative models. Such an approach should move beyond simply characterizing what the data looks like and instead focus on creating explicit, testable, and quantitative models of the biological processes that produced it. Here, we introduce and validate a framework that reframes physiological analysis as a form of formal hypothesis testing. We propose that a stereotyped autonomic response to an acute perturbation is a structured and dynamic process. Consequently, we suggest that it can be effectively modeled as a continuous-time stochastic process, allowing us to separate the structured response from inherent biological variability. Specifically, we model the response trajectory using a double-logistic function. This mathematical form is chosen as a parsimonious hypothesis for biphasic dynamics, designed to capture the characteristic onset and subsequent recovery phases</w:t>
-      </w:r>
-      <w:r>
-        <w:t xml:space="preserve"> </w:t>
-      </w:r>
-      <w:r>
-        <w:t xml:space="preserve">(Castillo-Aguilar et al. 2025)</w:t>
-      </w:r>
-      <w:r>
-        <w:t xml:space="preserve">. The power of this approach lies in its ability to translate the raw signal into a small set of interpretable mechanistic parameters: the latency, rate, and magnitude of each distinct response phase</w:t>
-      </w:r>
-      <w:r>
-        <w:t xml:space="preserve"> </w:t>
-      </w:r>
-      <w:r>
-        <w:t xml:space="preserve">(Castillo-Aguilar et al. 2025)</w:t>
-      </w:r>
-      <w:r>
-        <w:t xml:space="preserve">. This mechanism provides a direct, quantitative understanding of the system’s underlying reactivity and resilience.</w:t>
-      </w:r>
-    </w:p>
-    <w:p>
-      <w:pPr>
-        <w:pStyle w:val="BodyText"/>
-      </w:pPr>
-      <w:r>
-        <w:t xml:space="preserve">We implement this approach as a novel generative model within a Bayesian framework. This model provides robust parameter estimation with full uncertainty quantification, will allow hierarchical modeling of individual and group-level effects, and offers a basis for model comparison and evaluation. This model provides a specific and testable implementation of our framework, decomposing the RRi series into a time-varying mean, total variance, and a dynamically shifting oscillatory component, all controlled by a double-logistic latent dynamic. This paper tests the hypothesis that this model provides a more accurate and functional characterization of autonomic dynamics than existing fixed-time window methods. Through simulation, we demonstrate its capacity to recover known ground-truth parameters, which establishes its core validity. We contend that this approach provides the necessary quantitative indices for developing and testing mechanistic physiological hypotheses. This model represents a step towards translating complex time series into falsifiable knowledge.</w:t>
+        <w:t xml:space="preserve">We implement this framework as a generative model within a Bayesian paradigm. This enables robust parameter estimation with full uncertainty quantification, hierarchical modeling of individual and group-level effects, and formal model comparison. Concretely, our model decomposes RRi dynamics into a time-varying mean, variance, and oscillatory component, all governed by a double-logistic latent trajectory. Through simulations, we demonstrate its capacity to recover ground-truth parameters, establishing core validity. We contend that this approach provides the necessary quantitative indices for developing and testing mechanistic physiological hypotheses, thereby representing a critical step toward translating complex time series into falsifiable biological knowledge.</w:t>
       </w:r>
     </w:p>
     <w:bookmarkEnd w:id="20"/>
@@ -304,7 +285,7 @@
         <w:pStyle w:val="FirstParagraph"/>
       </w:pPr>
       <w:r>
-        <w:t xml:space="preserve">We first test the model’s internal consistency by assessing its ability to recover its own parameters from simulated data. We then benchmark its descriptive fidelity against conventional methods to quantify its effectiveness in characterizing dynamic signals. Finally, we use the framework to generate a structured, phenomenological description of an empirical exercise-response signal, illustrating its potential for developing precise and data-driven hypotheses.</w:t>
+        <w:t xml:space="preserve">After its construction, we test the BAND model’s internal consistency by assessing its ability to recover its own parameters from simulated data. We then benchmark its descriptive fidelity against conventional methods to quantify its effectiveness in characterizing dynamic signals. Finally, we use the framework to generate a structured, phenomenological description of an empirical exercise-response signal, illustrating its potential for developing precise and data-driven hypotheses.</w:t>
       </w:r>
     </w:p>
     <w:p>
@@ -324,10 +305,10 @@
           <w:b/>
           <w:bCs/>
         </w:rPr>
-        <w:t xml:space="preserve">Figure 1. Core components underlying observed RRi signals captured by the model</w:t>
-      </w:r>
-      <w:r>
-        <w:t xml:space="preserve">. The data generation process being modeled is represented as a linear combination of time and frequency components that build the underlying observed RRi signal as a dynamical and continuous process. In the top of the figure lies the model with each component separated in the subsequent bottom panels.</w:t>
+        <w:t xml:space="preserve">Figure 1. Core inferential procedure being captured by the model</w:t>
+      </w:r>
+      <w:r>
+        <w:t xml:space="preserve">. The data generation process being modeled is a transient stressor or perturbation from a baseline to a recovered state (1). This stimulus is being applied while the R-R intervals (RRi) is being recorded simultaneously (2). Then, the Biphasic Autonomic Non-stationary Decomposition (BAND) model takes the RRi data and decompose the data generation process as a linear combination of time and frequency components that build the underlying observed RRi signal as a dynamical and continuous process (3).</w:t>
       </w:r>
     </w:p>
     <w:bookmarkStart w:id="22" w:name="X9c2ecb1ed3ac6a0cac2e8bfe22e596d5ab34a26"/>
@@ -344,7 +325,23 @@
         <w:pStyle w:val="FirstParagraph"/>
       </w:pPr>
       <w:r>
-        <w:t xml:space="preserve">To establish the model’s internal consistency and the identifiability of its parameters, we first assessed its ability to perform inference on synthetic data generated from its own structure. This in-silico procedure serves as a necessary check of the model’s self-consistency and the estimation algorithm’s ability to navigate the complex posterior geometry. To test the model’s performance, three distinct scenarios were designed: (A) a canonical response with complete recovery; (B) an incomplete recovery with persistence in both time and frequency domains; and (C) a high-noise condition with a low structured variance fraction (</w:t>
+        <w:t xml:space="preserve">To establish the model’s internal consistency and the identifiability of its parameters, we first assessed its ability to perform inference on synthetic data generated from its own structure. This</w:t>
+      </w:r>
+      <w:r>
+        <w:t xml:space="preserve"> </w:t>
+      </w:r>
+      <w:r>
+        <w:rPr>
+          <w:i/>
+          <w:iCs/>
+        </w:rPr>
+        <w:t xml:space="preserve">in silico</w:t>
+      </w:r>
+      <w:r>
+        <w:t xml:space="preserve"> </w:t>
+      </w:r>
+      <w:r>
+        <w:t xml:space="preserve">procedure serves as a necessary check of the model’s self-consistency and the estimation algorithm’s ability to navigate the complex posterior geometry. To test the model’s performance, three distinct scenarios were designed: (A) a canonical response with complete recovery; (B) an incomplete recovery with persistence in both time and frequency domains; and (C) a high-noise condition with a low structured variance fraction (</w:t>
       </w:r>
       <m:oMath>
         <m:r>
@@ -888,7 +885,7 @@
         <w:t xml:space="preserve">(Rajendra Acharya et al. 2006; Lu et al. 2023)</w:t>
       </w:r>
       <w:r>
-        <w:t xml:space="preserve">. The present study was undertaken to develop and evaluate a generative probabilistic model for RRi time series, explicitly designed to represent and infer the parameters of transient physiological events. Our findings, based on a comprehensive suite of simulations and an empirical application, suggest that this inferential paradigm offers a more accurate and granular characterization of autonomic dynamics compared to what conventional windowed approaches can achieve. Our generative model provides a more detailed characterization of autonomic dynamics; however, its interpretation requires careful consideration of its underlying assumptions.</w:t>
+        <w:t xml:space="preserve">. The present study was undertaken to develop and evaluate a generative probabilistic model for RRi time series, explicitly designed to represent and infer the parameters of transient physiological events. Our findings, based on a comprehensive suite of simulations and an empirical application, suggest that the BAND framework offers a more accurate and granular characterization of autonomic dynamics compared to what conventional windowed approaches can achieve. Our generative model provides a more detailed characterization of autonomic dynamics; however, its interpretation requires careful consideration of its underlying assumptions.</w:t>
       </w:r>
     </w:p>
     <w:p>
@@ -896,7 +893,7 @@
         <w:pStyle w:val="BodyText"/>
       </w:pPr>
       <w:r>
-        <w:t xml:space="preserve">The primary contribution of this research is the novel synthesis and application of established Bayesian inference principles to construct a purpose-built, physiologically oriented measurement instrument</w:t>
+        <w:t xml:space="preserve">The primary contribution of this research is the synthesis and application of established Bayesian inference principles to construct a purpose-built, physiologically oriented measurement instrument</w:t>
       </w:r>
       <w:r>
         <w:t xml:space="preserve"> </w:t>
@@ -921,7 +918,23 @@
         <w:t xml:space="preserve"> </w:t>
       </w:r>
       <w:r>
-        <w:t xml:space="preserve">to signify this complete probabilistic specification, which enables a coherent inferential procedure regarding the model’s latent parameters. The internal validity and statistical integrity of this inferential process were examined through extensive simulation studies. In these controlled in-silico experiments, where the ground truth was known, the model consistently recovered the generative parameters, and its posterior credible intervals were well-calibrated</w:t>
+        <w:t xml:space="preserve">to signify this complete probabilistic specification, which enables a coherent inferential procedure regarding the model’s latent parameters. The internal validity and statistical integrity of this inferential process were examined through extensive simulation studies. In these controlled</w:t>
+      </w:r>
+      <w:r>
+        <w:t xml:space="preserve"> </w:t>
+      </w:r>
+      <w:r>
+        <w:rPr>
+          <w:i/>
+          <w:iCs/>
+        </w:rPr>
+        <w:t xml:space="preserve">in silico</w:t>
+      </w:r>
+      <w:r>
+        <w:t xml:space="preserve"> </w:t>
+      </w:r>
+      <w:r>
+        <w:t xml:space="preserve">experiments, where the ground truth was known, the model consistently recovered the generative parameters, and its posterior credible intervals were well-calibrated</w:t>
       </w:r>
       <w:r>
         <w:t xml:space="preserve"> </w:t>
@@ -1141,7 +1154,7 @@
         <w:t xml:space="preserve"> </w:t>
       </w:r>
       <w:r>
-        <w:t xml:space="preserve">remains a speculative hypothesis requiring external validation. Could this pattern alternatively reflect differential downregulation rates of adrenergic and cholinergic receptors, or a mismatch in the resetting of central autonomic command versus peripheral feedback? These are precisely the kinds of sophisticated hypotheses the model allows one to formulate, but it possesses no inherent capacity to adjudicate between them. It provides the tool to quantify the phenomenon with precision, thereby allowing for the examination of such hypotheses</w:t>
+        <w:t xml:space="preserve">remains a speculative hypothesis requiring external validation. Could this pattern alternatively reflect differential downregulation rates of adrenergic and cholinergic receptors, or a mismatch in the resetting of central autonomic command versus peripheral feedback? These are precisely the kinds of hypotheses the model allows one to formulate, but it possesses no inherent capacity to adjudicate between them. It provides the tool to quantify the phenomenon with precision, thereby allowing for the examination of such hypotheses</w:t>
       </w:r>
       <w:r>
         <w:t xml:space="preserve"> </w:t>
@@ -1390,7 +1403,7 @@
         <w:pStyle w:val="BodyText"/>
       </w:pPr>
       <w:r>
-        <w:t xml:space="preserve">The most urgent task is to initiate the calibration process for this instrument. Just as a new telescope must have its optical aberrations mapped and its resolution quantified, this model requires a comprehensive characterization of its operational properties. An ideal future study would involve establishing a formal calibration protocol: creating a standardized open-source library of synthetic RRi signals with known complexities, asymmetric responses, overlapping events, various artifact types, and non-Gaussian noise, and then systematically testing the model against this library. The results, published as a detailed</w:t>
+        <w:t xml:space="preserve">The most urgent task is to initiate the calibration process for this instrument. Just as a new telescope must have its optical aberrations mapped and its resolution quantified, this model requires a comprehensive characterization of its operational properties. An ideal future study would involve establishing a formal calibration protocol, creating a standardized open-source library of synthetic RRi signals with known complexities, asymmetric responses, overlapping events, various artifact types, and non-Gaussian noise, and then systematically testing the model against this library. The results, published as a detailed</w:t>
       </w:r>
       <w:r>
         <w:t xml:space="preserve"> </w:t>
@@ -1470,7 +1483,7 @@
         <w:pStyle w:val="FirstParagraph"/>
       </w:pPr>
       <w:r>
-        <w:t xml:space="preserve">We presented a comprehensive generative model for the RRi signal, observed at a discrete set of time points</w:t>
+        <w:t xml:space="preserve">This section details the formulation of the BAND model, a comprehensive generative framework for the RRi signal, observed at a discrete set of time points</w:t>
       </w:r>
       <w:r>
         <w:t xml:space="preserve"> </w:t>
@@ -1558,7 +1571,7 @@
         </m:d>
       </m:oMath>
       <w:r>
-        <w:t xml:space="preserve">, and a partitioned, time-varying standard deviation. This sophisticated approach moves beyond simple curve-fitting to formalize a theory of autonomic control and its temporal evolution within a fully Bayesian framework.</w:t>
+        <w:t xml:space="preserve">, and a partitioned, time-varying standard deviation. This approach moves beyond simple curve-fitting to formalize a theory of autonomic control and its temporal evolution within a fully Bayesian framework.</w:t>
       </w:r>
     </w:p>
     <w:p>
@@ -1787,7 +1800,7 @@
                 </m:rPr>
                 <m:t>,</m:t>
               </m:r>
-              <m:sSub>
+              <m:sSubSup>
                 <m:e>
                   <m:r>
                     <m:t>σ</m:t>
@@ -1802,7 +1815,12 @@
                     <m:t>resid</m:t>
                   </m:r>
                 </m:sub>
-              </m:sSub>
+                <m:sup>
+                  <m:r>
+                    <m:t>2</m:t>
+                  </m:r>
+                </m:sup>
+              </m:sSubSup>
               <m:d>
                 <m:dPr>
                   <m:begChr m:val="("/>
@@ -2558,7 +2576,7 @@
         <w:pStyle w:val="BodyText"/>
       </w:pPr>
       <w:r>
-        <w:t xml:space="preserve">A pivotal feature is a dynamic trajectory for the total signal variability, denoted</w:t>
+        <w:t xml:space="preserve">We partition the total signal variability,</w:t>
       </w:r>
       <w:r>
         <w:t xml:space="preserve"> </w:t>
@@ -2588,31 +2606,40 @@
           </m:rPr>
           <m:t>N</m:t>
         </m:r>
-        <m:d>
-          <m:dPr>
-            <m:begChr m:val="("/>
-            <m:sepChr m:val=""/>
-            <m:endChr m:val=")"/>
-            <m:grow/>
-          </m:dPr>
-          <m:e>
-            <m:sSub>
+        <m:sSup>
+          <m:e>
+            <m:d>
+              <m:dPr>
+                <m:begChr m:val="("/>
+                <m:sepChr m:val=""/>
+                <m:endChr m:val=")"/>
+                <m:grow/>
+              </m:dPr>
               <m:e>
-                <m:r>
-                  <m:t>t</m:t>
-                </m:r>
+                <m:sSub>
+                  <m:e>
+                    <m:r>
+                      <m:t>t</m:t>
+                    </m:r>
+                  </m:e>
+                  <m:sub>
+                    <m:r>
+                      <m:t>i</m:t>
+                    </m:r>
+                  </m:sub>
+                </m:sSub>
               </m:e>
-              <m:sub>
-                <m:r>
-                  <m:t>i</m:t>
-                </m:r>
-              </m:sub>
-            </m:sSub>
-          </m:e>
-        </m:d>
+            </m:d>
+          </m:e>
+          <m:sup>
+            <m:r>
+              <m:t>2</m:t>
+            </m:r>
+          </m:sup>
+        </m:sSup>
       </m:oMath>
       <w:r>
-        <w:t xml:space="preserve">, which is then partitioned into its structured and residual components. This partition is controlled by a parameter,</w:t>
+        <w:t xml:space="preserve">, into two components. This partition is governed by a single parameter,</w:t>
       </w:r>
       <w:r>
         <w:t xml:space="preserve"> </w:t>
@@ -2651,7 +2678,24 @@
         </m:d>
       </m:oMath>
       <w:r>
-        <w:t xml:space="preserve">, which represents the fraction of total variance attributable to the structured component, as defined in</w:t>
+        <w:t xml:space="preserve">, which represents the fraction of total variance that is considered physiologically structured (i.e., oscillatory). The remaining fraction, (</w:t>
+      </w:r>
+      <m:oMath>
+        <m:r>
+          <m:t>1</m:t>
+        </m:r>
+        <m:r>
+          <m:rPr>
+            <m:sty m:val="p"/>
+          </m:rPr>
+          <m:t>−</m:t>
+        </m:r>
+        <m:r>
+          <m:t>w</m:t>
+        </m:r>
+      </m:oMath>
+      <w:r>
+        <w:t xml:space="preserve">), is treated as unstructured residual noise. This relationship is formalized in in</w:t>
       </w:r>
       <w:r>
         <w:t xml:space="preserve"> </w:t>
@@ -2980,7 +3024,7 @@
         <w:pStyle w:val="FirstParagraph"/>
       </w:pPr>
       <w:r>
-        <w:t xml:space="preserve">This formulation allows the model to simultaneously learn not only how the total amount of HRV changes over time (via</w:t>
+        <w:t xml:space="preserve">This formulation allows the model to simultaneously infer not only how the total amount of HRV changes over time (via</w:t>
       </w:r>
       <w:r>
         <w:t xml:space="preserve"> </w:t>
@@ -4321,7 +4365,171 @@
         <w:t xml:space="preserve"> </w:t>
       </w:r>
       <w:r>
-        <w:t xml:space="preserve">are analogous to their counterparts in the baseline model, representing the resting total SDNN, the magnitude of its suppression or increase, and its fractional recovery, respectively. The dynamics for both trajectories are driven by a shared pair of logistic transition functions,</w:t>
+        <w:t xml:space="preserve">are analogous to their counterparts in the baseline model, representing the resting total SDNN, the magnitude of its suppression or increase, and its fractional recovery, respectively. The</w:t>
+      </w:r>
+      <w:r>
+        <w:t xml:space="preserve"> </w:t>
+      </w:r>
+      <m:oMath>
+        <m:r>
+          <m:rPr>
+            <m:sty m:val="p"/>
+          </m:rPr>
+          <m:t>S</m:t>
+        </m:r>
+        <m:r>
+          <m:rPr>
+            <m:sty m:val="p"/>
+          </m:rPr>
+          <m:t>D</m:t>
+        </m:r>
+        <m:r>
+          <m:rPr>
+            <m:sty m:val="p"/>
+          </m:rPr>
+          <m:t>N</m:t>
+        </m:r>
+        <m:r>
+          <m:rPr>
+            <m:sty m:val="p"/>
+          </m:rPr>
+          <m:t>N</m:t>
+        </m:r>
+        <m:d>
+          <m:dPr>
+            <m:begChr m:val="("/>
+            <m:sepChr m:val=""/>
+            <m:endChr m:val=")"/>
+            <m:grow/>
+          </m:dPr>
+          <m:e>
+            <m:sSub>
+              <m:e>
+                <m:r>
+                  <m:t>t</m:t>
+                </m:r>
+              </m:e>
+              <m:sub>
+                <m:r>
+                  <m:t>i</m:t>
+                </m:r>
+              </m:sub>
+            </m:sSub>
+          </m:e>
+        </m:d>
+      </m:oMath>
+      <w:r>
+        <w:t xml:space="preserve"> </w:t>
+      </w:r>
+      <w:r>
+        <w:t xml:space="preserve">trajectory thus serves as a master controller for the total instantaneous variability in the signal. This total variance is then partitioned into a structured, oscillatory component and an unstructured, residual noise component, as defined in</w:t>
+      </w:r>
+      <w:r>
+        <w:t xml:space="preserve"> </w:t>
+      </w:r>
+      <w:hyperlink w:anchor="eq-var-structure">
+        <w:r>
+          <w:rPr>
+            <w:rStyle w:val="Hyperlink"/>
+          </w:rPr>
+          <w:t xml:space="preserve">Equation 3</w:t>
+        </w:r>
+      </w:hyperlink>
+      <w:r>
+        <w:t xml:space="preserve">.</w:t>
+      </w:r>
+    </w:p>
+    <w:p>
+      <w:pPr>
+        <w:pStyle w:val="BodyText"/>
+      </w:pPr>
+      <w:r>
+        <w:t xml:space="preserve">The dynamics for both trajectories (i.e.,</w:t>
+      </w:r>
+      <w:r>
+        <w:t xml:space="preserve"> </w:t>
+      </w:r>
+      <m:oMath>
+        <m:r>
+          <m:rPr>
+            <m:sty m:val="p"/>
+          </m:rPr>
+          <m:t>R</m:t>
+        </m:r>
+        <m:sSub>
+          <m:e>
+            <m:r>
+              <m:rPr>
+                <m:sty m:val="p"/>
+              </m:rPr>
+              <m:t>R</m:t>
+            </m:r>
+          </m:e>
+          <m:sub>
+            <m:r>
+              <m:rPr>
+                <m:sty m:val="p"/>
+              </m:rPr>
+              <m:t>b</m:t>
+            </m:r>
+            <m:r>
+              <m:rPr>
+                <m:sty m:val="p"/>
+              </m:rPr>
+              <m:t>a</m:t>
+            </m:r>
+            <m:r>
+              <m:rPr>
+                <m:sty m:val="p"/>
+              </m:rPr>
+              <m:t>s</m:t>
+            </m:r>
+            <m:r>
+              <m:rPr>
+                <m:sty m:val="p"/>
+              </m:rPr>
+              <m:t>e</m:t>
+            </m:r>
+          </m:sub>
+        </m:sSub>
+      </m:oMath>
+      <w:r>
+        <w:t xml:space="preserve"> </w:t>
+      </w:r>
+      <w:r>
+        <w:t xml:space="preserve">and</w:t>
+      </w:r>
+      <w:r>
+        <w:t xml:space="preserve"> </w:t>
+      </w:r>
+      <m:oMath>
+        <m:r>
+          <m:rPr>
+            <m:sty m:val="p"/>
+          </m:rPr>
+          <m:t>S</m:t>
+        </m:r>
+        <m:r>
+          <m:rPr>
+            <m:sty m:val="p"/>
+          </m:rPr>
+          <m:t>D</m:t>
+        </m:r>
+        <m:r>
+          <m:rPr>
+            <m:sty m:val="p"/>
+          </m:rPr>
+          <m:t>N</m:t>
+        </m:r>
+        <m:r>
+          <m:rPr>
+            <m:sty m:val="p"/>
+          </m:rPr>
+          <m:t>N</m:t>
+        </m:r>
+      </m:oMath>
+      <w:r>
+        <w:t xml:space="preserve">), are driven by a shared pair of logistic transition functions,</w:t>
       </w:r>
       <w:r>
         <w:t xml:space="preserve"> </w:t>
@@ -4813,7 +5021,7 @@
         </m:r>
       </m:oMath>
       <w:r>
-        <w:t xml:space="preserve">. This shared structure ensures that changes in the magnitude of variability are temporally synchronized with changes in the mean heart period, while still allowing their relative magnitudes and recovery profiles to differ.</w:t>
+        <w:t xml:space="preserve">. This shared structure ensures that all dynamic components of the model are driven by a single, unified underlying process.</w:t>
       </w:r>
     </w:p>
     <w:bookmarkEnd w:id="36"/>
@@ -4831,7 +5039,15 @@
         <w:pStyle w:val="FirstParagraph"/>
       </w:pPr>
       <w:r>
-        <w:t xml:space="preserve">The structured component of the signal is where the model’s spectral properties are defined. Its construction involves three key elements: the dynamic spectral proportions, the latent spectral oscillators (whose amplitudes are governed by a Gaussian Process), and a deterministic amplitude inversion that ties them to the target variance.</w:t>
+        <w:t xml:space="preserve">The model partitions the signal into structured components, composed of three standard physiological frequency bands: very-low-frequency (VLF) from 0.003 to 0.04 Hz, low-frequency (LF) from 0.04 to 0.15 Hz, and high-frequency (HF) from 0.15 to 0.4 Hz.</w:t>
+      </w:r>
+    </w:p>
+    <w:p>
+      <w:pPr>
+        <w:pStyle w:val="BodyText"/>
+      </w:pPr>
+      <w:r>
+        <w:t xml:space="preserve">The structured component of the signal is where the model’s spectral properties are defined. Its construction involves three key elements; the dynamic spectral proportions, the latent spectral oscillators (whose amplitudes are governed by a Gaussian Process), and a deterministic amplitude inversion that ties them to the target variance.</w:t>
       </w:r>
     </w:p>
     <w:bookmarkStart w:id="39" w:name="dynamic-frequency-band-proportions"/>
@@ -5033,7 +5249,7 @@
         </m:d>
       </m:oMath>
       <w:r>
-        <w:t xml:space="preserve">, as shown in the convex combination of</w:t>
+        <w:t xml:space="preserve">, as shown in</w:t>
       </w:r>
       <w:r>
         <w:t xml:space="preserve"> </w:t>
@@ -5047,8 +5263,110 @@
         </w:r>
       </w:hyperlink>
       <w:r>
-        <w:t xml:space="preserve">.</w:t>
-      </w:r>
+        <w:t xml:space="preserve">. Here,</w:t>
+      </w:r>
+      <w:r>
+        <w:t xml:space="preserve"> </w:t>
+      </w:r>
+      <m:oMath>
+        <m:acc>
+          <m:accPr>
+            <m:chr m:val="⃗"/>
+          </m:accPr>
+          <m:e>
+            <m:r>
+              <m:t>p</m:t>
+            </m:r>
+          </m:e>
+        </m:acc>
+        <m:d>
+          <m:dPr>
+            <m:begChr m:val="("/>
+            <m:sepChr m:val=""/>
+            <m:endChr m:val=")"/>
+            <m:grow/>
+          </m:dPr>
+          <m:e>
+            <m:sSub>
+              <m:e>
+                <m:r>
+                  <m:t>t</m:t>
+                </m:r>
+              </m:e>
+              <m:sub>
+                <m:r>
+                  <m:t>i</m:t>
+                </m:r>
+              </m:sub>
+            </m:sSub>
+          </m:e>
+        </m:d>
+      </m:oMath>
+      <w:r>
+        <w:t xml:space="preserve"> </w:t>
+      </w:r>
+      <w:r>
+        <w:t xml:space="preserve">is the 3x1 vector of proportions at time</w:t>
+      </w:r>
+      <w:r>
+        <w:t xml:space="preserve"> </w:t>
+      </w:r>
+      <m:oMath>
+        <m:sSub>
+          <m:e>
+            <m:r>
+              <m:t>t</m:t>
+            </m:r>
+          </m:e>
+          <m:sub>
+            <m:r>
+              <m:t>i</m:t>
+            </m:r>
+          </m:sub>
+        </m:sSub>
+      </m:oMath>
+      <w:r>
+        <w:t xml:space="preserve">, whose j-th element is</w:t>
+      </w:r>
+      <w:r>
+        <w:t xml:space="preserve"> </w:t>
+      </w:r>
+      <m:oMath>
+        <m:sSub>
+          <m:e>
+            <m:r>
+              <m:t>p</m:t>
+            </m:r>
+          </m:e>
+          <m:sub>
+            <m:r>
+              <m:t>j</m:t>
+            </m:r>
+          </m:sub>
+        </m:sSub>
+        <m:d>
+          <m:dPr>
+            <m:begChr m:val="("/>
+            <m:sepChr m:val=""/>
+            <m:endChr m:val=")"/>
+            <m:grow/>
+          </m:dPr>
+          <m:e>
+            <m:sSub>
+              <m:e>
+                <m:r>
+                  <m:t>t</m:t>
+                </m:r>
+              </m:e>
+              <m:sub>
+                <m:r>
+                  <m:t>i</m:t>
+                </m:r>
+              </m:sub>
+            </m:sSub>
+          </m:e>
+        </m:d>
+      </m:oMath>
     </w:p>
     <w:p>
       <w:pPr>
@@ -5677,7 +5995,7 @@
         <w:t xml:space="preserve">(Binois and Wycoff 2022)</w:t>
       </w:r>
       <w:r>
-        <w:t xml:space="preserve">. In this context, it formalizes the intuition that the amplitudes of nearby frequencies should be similar, allowing the model to learn the characteristic shape of the spectrum within each band directly from the data.</w:t>
+        <w:t xml:space="preserve">. In this context, it formalizes the intuition that the amplitudes of nearby frequencies should be similar, allowing the model to infer the characteristic shape of the spectrum within each band directly from the data.</w:t>
       </w:r>
     </w:p>
     <w:p>
@@ -6196,7 +6514,7 @@
         </m:sSub>
       </m:oMath>
       <w:r>
-        <w:t xml:space="preserve">), defined in</w:t>
+        <w:t xml:space="preserve">), also known as a radial basis function (RBF) kernel, defined in</w:t>
       </w:r>
       <w:r>
         <w:t xml:space="preserve"> </w:t>
@@ -6210,7 +6528,7 @@
         </w:r>
       </w:hyperlink>
       <w:r>
-        <w:t xml:space="preserve">.</w:t>
+        <w:t xml:space="preserve">. The term in the numerator represents the squared Euclidean distance between two points on the scaled log-frequency axis. This kernel is chosen because it formalizes the assumption that the spectral envelope is a smooth, continuous function, which is a strong but reasonable prior for physiological spectra.</w:t>
       </w:r>
     </w:p>
     <w:p>
@@ -6560,7 +6878,10 @@
         </m:sSub>
       </m:oMath>
       <w:r>
-        <w:t xml:space="preserve">. The marginal standard deviation of the GP is fixed to 1. This is because the GP’s role is strictly to define the</w:t>
+        <w:t xml:space="preserve"> </w:t>
+      </w:r>
+      <w:r>
+        <w:t xml:space="preserve">(a parameter controlling smoothness, not to be confused with a correlation coefficient), which determines the smoothness of the spectral envelope. The marginal standard deviation of the GP is fixed to 1. This is because the GP’s role is strictly to define the</w:t>
       </w:r>
       <w:r>
         <w:t xml:space="preserve"> </w:t>
@@ -6987,7 +7308,7 @@
         <w:pStyle w:val="BodyText"/>
       </w:pPr>
       <w:r>
-        <w:t xml:space="preserve">To resolve this, we enforce a clear division of labor. The Gaussian Process is assigned the exclusive role of determining the relative shape of the spectrum, while</w:t>
+        <w:t xml:space="preserve">This normalization procedure is a critical step to ensure that the model’s parameters are identifiable. Its purpose is to assign a clear division of labor. The Gaussian Process exclusively determines the relative shape of the spectrum, while the time-varying amplitude</w:t>
       </w:r>
       <w:r>
         <w:t xml:space="preserve"> </w:t>
@@ -7023,7 +7344,7 @@
         <w:t xml:space="preserve"> </w:t>
       </w:r>
       <w:r>
-        <w:t xml:space="preserve">is assigned the role of setting the absolute power.</w:t>
+        <w:t xml:space="preserve">exclusively determines its absolute magnitude.</w:t>
       </w:r>
     </w:p>
     <w:p>
@@ -10532,7 +10853,7 @@
         <w:pStyle w:val="BodyText"/>
       </w:pPr>
       <w:r>
-        <w:t xml:space="preserve">We designed three distinct scenarios to probe the model’s capabilities under diverse and challenging conditions. These scenarios: (A) a classic sympatho-vagal response, (B) an incomplete recovery with time-domain and spectral persistence, and (C) an incomplete spectral but complete time-domain recovery with high noise, were chosen specifically to test the limitations inherent in standard analysis methods. Each simulated dataset was analyzed with our complete Bayesian model and, for comparison, with conventional techniques: a sliding-window analysis for time-domain metrics and a Short-Time Fourier Transform (STFT) for spectral dynamics.</w:t>
+        <w:t xml:space="preserve">We designed three distinct scenarios to probe the model’s capabilities under diverse and challenging conditions. These scenarios: (A) a classic sympatho-vagal response, (B) an incomplete recovery with time-domain and spectral persistence, and (C) an incomplete spectral but complete time-domain recovery with high noise, were chosen specifically to test the limitations inherent in standard analysis methods. Each simulated dataset was analyzed with our complete Bayesian model and, for comparison, with conventional techniques: 1) a sliding-window analysis for time-domain metrics and 2) a Short-Time Fourier Transform (STFT) for spectral dynamics.</w:t>
       </w:r>
     </w:p>
     <w:bookmarkStart w:id="53" w:name="time-domain-trajectory-reconstruction"/>

</xml_diff>

<commit_message>
update figure 1 and 5, remove fig 6, more concise writing
</commit_message>
<xml_diff>
--- a/index.docx
+++ b/index.docx
@@ -457,7 +457,7 @@
         <w:pStyle w:val="FirstParagraph"/>
       </w:pPr>
       <w:r>
-        <w:t xml:space="preserve">Having established the model’s internal consistency, we next benchmarked its descriptive performance against conventional, widely adopted analytical methods. The objective of this comparison was to quantify the core differences in how these analytical frameworks represent and summarize dynamic signals, and to highlight the specific conditions under which our proposed model offers a more advantageous description. The same synthetic datasets from the previous section were analyzed using a 60-second sliding-window analysis for time-domain metrics (mean RRi and SDNN), and a Short-Time Fourier Transform (STFT) with a similar window length for characterizing spectral dynamics.</w:t>
+        <w:t xml:space="preserve">Having established the model’s internal consistency, we next benchmarked its descriptive performance against conventional, widely adopted analytical methods. The objective of this comparison was to quantify the core differences in how these analytical frameworks represent and summarize dynamic signals, and to highlight the specific conditions under which our proposed model offers a more advantageous description and performance. The same synthetic datasets from the previous section were analyzed using a 60-second sliding-window analysis for time-domain metrics (mean RRi and SDNN), and a Short-Time Fourier Transform (STFT) with a similar window length for characterizing spectral dynamics. The STFT, and similar Fourier methods, allows to decompose the signal into frequency bands that compose the complete signal, which helps in the identification of the relative contribution of major frequency bands (which BAND model mechanistically performs as part of its architecture).</w:t>
       </w:r>
     </w:p>
     <w:p>
@@ -465,7 +465,7 @@
         <w:pStyle w:val="BodyText"/>
       </w:pPr>
       <w:r>
-        <w:t xml:space="preserve">The results of this comparative analysis highlights the descriptive distortions that are inherent to any method that relies on assumptions of local stationarity when applied to a continuously varying, non-stationary signal. Figure 4 illustrates the outputs from the windowed methods. Visually, these methods produced a delayed and morphologically blunted approximation of the underlying dynamics. The sharp, non-linear transitions that characterize the onset and recovery phases of the signal are smeared and flattened by the averaging process inherent in the windowed calculation. Consequently, the windowed approach failed to accurately capture both the shape and the precise timing of the recovery process. Instead of reflecting the smooth, logistic curve defined by the ground-truth process, the windowed analysis superimposed the square-wave artifacts of its own computational structure onto the data, a clear instance of the analytical method distorting the phenomenon it is intended to measure.</w:t>
+        <w:t xml:space="preserve">The results of this comparative analysis highlights the descriptive distortions that are inherent to any method that relies on assumptions of local stationarity when applied to a continuously varying, non-stationary signal. Figure 4 illustrates the outputs from the windowed methods. Visually, these methods produced a delayed and morphologically blunted approximation of the underlying dynamics. The sharp, non-linear transitions that characterize the onset and recovery phases of the signal are smeared and flattened by the averaging process inherent in the windowed calculation. Consequently, the windowed approach failed to accurately capture both the shape and the precise timing of the recovery process. Instead of reflecting the smooth, logistic curve defined by the ground-truth process, the windowed analysis superimposed the square-wave artifacts of its own computational structure onto the data, a clear instance of the analytical method distorting the phenomenon it is intended to measure. As expected</w:t>
       </w:r>
     </w:p>
     <w:p>
@@ -557,7 +557,23 @@
         <w:pStyle w:val="BodyText"/>
       </w:pPr>
       <w:r>
-        <w:t xml:space="preserve">Further model diagnostics testing the model’s overall stability and reliability can be found in the supplementary material. Prior predictive checks are shown in Figure S1, prior sensitivity analysis in Figure S2, full posterior distributions in Figure S3, and model fit to asymmetric recovery data from a different data generation process in Figure S4. Additionally, non-Gaussian distributions are presented in Figure S5.</w:t>
+        <w:t xml:space="preserve">Further model diagnostics testing the model’s overall stability and reliability on synthetic data for</w:t>
+      </w:r>
+      <w:r>
+        <w:t xml:space="preserve"> </w:t>
+      </w:r>
+      <w:r>
+        <w:rPr>
+          <w:i/>
+          <w:iCs/>
+        </w:rPr>
+        <w:t xml:space="preserve">in silico</w:t>
+      </w:r>
+      <w:r>
+        <w:t xml:space="preserve"> </w:t>
+      </w:r>
+      <w:r>
+        <w:t xml:space="preserve">validation can be found in the supplementary material. Prior predictive checks are shown in Figure S1, prior sensitivity analysis in Figure S2, full posterior distributions in Figure S3, and model fit to asymmetric recovery data from a different data generation process in Figure S4. Additionally, non-Gaussian distributions are presented in Figure S5.</w:t>
       </w:r>
     </w:p>
     <w:bookmarkEnd w:id="21"/>
@@ -584,7 +600,7 @@
         <w:pStyle w:val="BodyText"/>
       </w:pPr>
       <w:r>
-        <w:t xml:space="preserve">Upon fitting the model to the empirical data, it yields a phenomenological decomposition of the entire exercise-recovery response, as depicted in Figure 5. The framework parses the signal into its constituent components, describing the physiological process as a rapid initial tachycardia (a decrease in the baseline RRi component) and a concurrent suppression of total heart rate variability (a decrease in the SDNN component). This initial response is followed by a slower, more gradual recovery phase after the cessation of the exercise stimulus. From a spectral perspective, the model attributes the signature of this response to a near-complete withdrawal of power in the high-frequency (HF) band, a correlate of parasympathetic activity, and a corresponding surge in the proportion of very-low-frequency (VLF) power, a band whose physiological interpretation remains debated but is often associated with sympathetic and other systemic influences. The model captures these dynamics as continuous, smooth trajectories, providing an integrated narrative of the entire physiological event.</w:t>
+        <w:t xml:space="preserve">Upon fitting the model to the empirical data, it yields a phenomenological decomposition of the entire exercise-recovery response, as depicted in Figure 5. The framework parses the signal into its constituent components, describing the physiological process as a rapid initial tachycardia (a decrease in the baseline RRi component, panel A and B in Figure 5) and a concurrent suppression of total heart rate variability (a decrease in the SDNN component, panel C in Figure 5). This initial response is followed by a slower, more gradual recovery phase after the cessation of the exercise stimulus. From a spectral perspective, the model attributes the signature of this response to a near-complete withdrawal of power in the high-frequency (HF) band, and a corresponding surge in the proportion of very-low-frequency (VLF) power (panel D in Figure 5). The model captures these dynamics as continuous, smooth trajectories, providing an integrated narrative of the entire physiological event.</w:t>
       </w:r>
     </w:p>
     <w:p>
@@ -602,43 +618,7 @@
         <w:t xml:space="preserve"> </w:t>
       </w:r>
       <w:r>
-        <w:t xml:space="preserve">(A) The reconstructed</w:t>
-      </w:r>
-      <w:r>
-        <w:t xml:space="preserve"> </w:t>
-      </w:r>
-      <m:oMath>
-        <m:r>
-          <m:t>μ</m:t>
-        </m:r>
-        <m:d>
-          <m:dPr>
-            <m:begChr m:val="("/>
-            <m:sepChr m:val=""/>
-            <m:endChr m:val=")"/>
-            <m:grow/>
-          </m:dPr>
-          <m:e>
-            <m:sSub>
-              <m:e>
-                <m:r>
-                  <m:t>t</m:t>
-                </m:r>
-              </m:e>
-              <m:sub>
-                <m:r>
-                  <m:t>i</m:t>
-                </m:r>
-              </m:sub>
-            </m:sSub>
-          </m:e>
-        </m:d>
-      </m:oMath>
-      <w:r>
-        <w:t xml:space="preserve"> </w:t>
-      </w:r>
-      <w:r>
-        <w:t xml:space="preserve">RRi signal (red line) overlaid on top of the observed RRi signal (gray). (B-C) time-domain components: the baseline RRi trend (</w:t>
+        <w:t xml:space="preserve">The figure illustrates the reconstructed RRi signal (red line in panel A) overlaid on top of the observed RRi signal (gray). In the bottom panel, the Biphasic Autonomic Non-stationary Decomposition (BAND) model components appear. First, the time-domain components: the baseline RRi trend (</w:t>
       </w:r>
       <m:oMath>
         <m:r>
@@ -685,7 +665,7 @@
         </m:sSub>
       </m:oMath>
       <w:r>
-        <w:t xml:space="preserve">, blue) and the total instantaneous variability (</w:t>
+        <w:t xml:space="preserve">, blue line, panel B) and the total instantaneous variability (</w:t>
       </w:r>
       <m:oMath>
         <m:r>
@@ -714,7 +694,7 @@
         </m:r>
       </m:oMath>
       <w:r>
-        <w:t xml:space="preserve">, orange). (D) The inferred dynamics of the spectral proportions. The shaded regions represent the 95% highest density intervals.</w:t>
+        <w:t xml:space="preserve">, orange, panel C). Additionally, the inferred dynamics of the spectral proportions is also present, describing the evolution of frequency band relative participation across the transient stimulus (panel D). The shaded regions represent the 95% highest density intervals.</w:t>
       </w:r>
     </w:p>
     <w:p>
@@ -722,7 +702,7 @@
         <w:pStyle w:val="BodyText"/>
       </w:pPr>
       <w:r>
-        <w:t xml:space="preserve">The framework’s primary scientific utility, however, lies in generating quantitative, testable claims, which are encapsulated by the posterior distributions of its parameters (Figure 6). A key feature of the model is its separate parameterization of the recovery dynamics of the signal’s first moment (mean RRi, via the coefficient</w:t>
+        <w:t xml:space="preserve">The framework’s primary scientific utility, however, lies in generating quantitative, testable claims, which are encapsulated by the posterior distributions of its parameters. A key feature of the model is its separate parameterization of the recovery dynamics of the signal’s first moment (mean RRi, via the coefficient</w:t>
       </w:r>
       <w:r>
         <w:t xml:space="preserve"> </w:t>
@@ -785,7 +765,16 @@
         <w:t xml:space="preserve"> </w:t>
       </w:r>
       <w:r>
-        <w:t xml:space="preserve">was clearly separated from that for</w:t>
+        <w:t xml:space="preserve">(median of the posterior distribution = 0.69, CI</w:t>
+      </w:r>
+      <w:r>
+        <w:rPr>
+          <w:vertAlign w:val="subscript"/>
+        </w:rPr>
+        <w:t xml:space="preserve">95%</w:t>
+      </w:r>
+      <w:r>
+        <w:t xml:space="preserve">[0.66, 0.73]) was clearly separated from that for</w:t>
       </w:r>
       <w:r>
         <w:t xml:space="preserve"> </w:t>
@@ -805,7 +794,19 @@
         </m:sSub>
       </m:oMath>
       <w:r>
-        <w:t xml:space="preserve">. This descriptive feature of the model’s output, which we term model-inferred dissonance, provides a data-driven and falsifiable hypothesis: that the recovery of mean heart rate and the recovery of its variability can follow distinct and dissociable time courses in response to an acute exercise stressor. This hypothesis is a quantitative statement, grounded in the posterior probability distributions of the model’s parameters.</w:t>
+        <w:t xml:space="preserve"> </w:t>
+      </w:r>
+      <w:r>
+        <w:t xml:space="preserve">(median = 0.97, CI</w:t>
+      </w:r>
+      <w:r>
+        <w:rPr>
+          <w:vertAlign w:val="subscript"/>
+        </w:rPr>
+        <w:t xml:space="preserve">95%</w:t>
+      </w:r>
+      <w:r>
+        <w:t xml:space="preserve">[0.91, 1.00]). This descriptive feature of the model’s output, which we term model-inferred dissonance, provides a data-driven and falsifiable hypothesis: that the recovery of mean heart rate and the recovery of its variability can follow distinct and dissociable time courses in response to an acute exercise stressor. This hypothesis is a quantitative statement, grounded in the posterior probability distributions of the model’s parameters.</w:t>
       </w:r>
     </w:p>
     <w:p>
@@ -813,33 +814,7 @@
         <w:pStyle w:val="BodyText"/>
       </w:pPr>
       <w:r>
-        <w:rPr>
-          <w:b/>
-          <w:bCs/>
-        </w:rPr>
-        <w:t xml:space="preserve">Figure 6. Posterior distribution of phenomenological recovery parameters from the empirical analysis.</w:t>
-      </w:r>
-      <w:r>
-        <w:t xml:space="preserve"> </w:t>
-      </w:r>
-      <w:r>
-        <w:t xml:space="preserve">The posterior distribution for the recovered coefficients of transient changes in mean RRi, total SDNN, and spectral balance, alongside the structured variance fraction (</w:t>
-      </w:r>
-      <m:oMath>
-        <m:r>
-          <m:t>w</m:t>
-        </m:r>
-      </m:oMath>
-      <w:r>
-        <w:t xml:space="preserve">). The posterior distribution allows for visual inspection of model convergence of model parameters.</w:t>
-      </w:r>
-    </w:p>
-    <w:p>
-      <w:pPr>
-        <w:pStyle w:val="BodyText"/>
-      </w:pPr>
-      <w:r>
-        <w:t xml:space="preserve">Additional model diagnostics can be seen in the supplementary material, where complete traceplots and MCMC diagnostics can be seen in Figure S6 and Table S1, respectively. Posterior predictive checks can be seen in Figure S7 and S8.</w:t>
+        <w:t xml:space="preserve">Empirical and visual model diagnostics can be seen in the supplementary material. Complete traceplots, posterior distributions and MCMC diagnostics can be seen in Figure S6, S7 and Table S1, respectively. Posterior and distributional predictive checks can be seen in Figure S8 and S9.</w:t>
       </w:r>
     </w:p>
     <w:bookmarkEnd w:id="23"/>

</xml_diff>